<commit_message>
Update header design: tiered layout, transparent rows, 3-line contact info, and mobile menu repositioning. Cleaned up folder structure.
</commit_message>
<xml_diff>
--- a/Shan Group Hospital_1.docx
+++ b/Shan Group Hospital_1.docx
@@ -1024,7 +1024,27 @@
           <w:szCs w:val="24"/>
           <w:lang w:eastAsia="en-IN"/>
         </w:rPr>
-        <w:t>X-ray, MRI, CT Scan, and Ultrasound</w:t>
+        <w:t xml:space="preserve">X-ray, MRI, </w:t>
+      </w:r>
+      <w:proofErr w:type="gramStart"/>
+      <w:r>
+        <w:rPr>
+          <w:rFonts w:ascii="Times New Roman" w:eastAsia="Times New Roman" w:hAnsi="Times New Roman" w:cs="Times New Roman"/>
+          <w:sz w:val="24"/>
+          <w:szCs w:val="24"/>
+          <w:lang w:eastAsia="en-IN"/>
+        </w:rPr>
+        <w:t>CT Scan</w:t>
+      </w:r>
+      <w:proofErr w:type="gramEnd"/>
+      <w:r>
+        <w:rPr>
+          <w:rFonts w:ascii="Times New Roman" w:eastAsia="Times New Roman" w:hAnsi="Times New Roman" w:cs="Times New Roman"/>
+          <w:sz w:val="24"/>
+          <w:szCs w:val="24"/>
+          <w:lang w:eastAsia="en-IN"/>
+        </w:rPr>
+        <w:t>, and Ultrasound</w:t>
       </w:r>
     </w:p>
     <w:p>
@@ -1440,7 +1460,7 @@
           <w:lang w:val="en-US" w:eastAsia="en-IN"/>
         </w:rPr>
         <w:pict w14:anchorId="311B1D83">
-          <v:rect id="_x0000_i1104" style="width:0;height:1.5pt" o:hralign="center" o:hrstd="t" o:hr="t" fillcolor="#a0a0a0" stroked="f"/>
+          <v:rect id="_x0000_i1026" style="width:0;height:1.5pt" o:hralign="center" o:hrstd="t" o:hr="t" fillcolor="#a0a0a0" stroked="f"/>
         </w:pict>
       </w:r>
     </w:p>
@@ -1747,7 +1767,7 @@
           <w:lang w:val="en-US" w:eastAsia="en-IN"/>
         </w:rPr>
         <w:pict w14:anchorId="7847FCC8">
-          <v:rect id="_x0000_i1105" style="width:0;height:1.5pt" o:hralign="center" o:hrstd="t" o:hr="t" fillcolor="#a0a0a0" stroked="f"/>
+          <v:rect id="_x0000_i1027" style="width:0;height:1.5pt" o:hralign="center" o:hrstd="t" o:hr="t" fillcolor="#a0a0a0" stroked="f"/>
         </w:pict>
       </w:r>
     </w:p>
@@ -1978,7 +1998,7 @@
           <w:lang w:val="en-US" w:eastAsia="en-IN"/>
         </w:rPr>
         <w:pict w14:anchorId="7CB98ED2">
-          <v:rect id="_x0000_i1106" style="width:0;height:1.5pt" o:hralign="center" o:hrstd="t" o:hr="t" fillcolor="#a0a0a0" stroked="f"/>
+          <v:rect id="_x0000_i1028" style="width:0;height:1.5pt" o:hralign="center" o:hrstd="t" o:hr="t" fillcolor="#a0a0a0" stroked="f"/>
         </w:pict>
       </w:r>
     </w:p>
@@ -2194,13 +2214,14 @@
       <w:r>
         <w:rPr>
           <w:rFonts w:ascii="Times New Roman" w:eastAsia="Times New Roman" w:hAnsi="Times New Roman" w:cs="Times New Roman"/>
+          <w:noProof/>
           <w:sz w:val="27"/>
           <w:szCs w:val="27"/>
           <w:lang w:val="en-US" w:eastAsia="en-IN"/>
         </w:rPr>
         <w:lastRenderedPageBreak/>
         <w:drawing>
-          <wp:inline distT="0" distB="0" distL="0" distR="0" wp14:anchorId="75A90C64" wp14:editId="73F8EE81">
+          <wp:inline distT="0" distB="0" distL="0" distR="0" wp14:anchorId="75A90C64" wp14:editId="6A07DFF7">
             <wp:extent cx="5731510" cy="3820795"/>
             <wp:effectExtent l="0" t="0" r="2540" b="8255"/>
             <wp:docPr id="24" name="Picture 24"/>
@@ -2263,6 +2284,7 @@
       <w:r>
         <w:rPr>
           <w:rFonts w:ascii="Times New Roman" w:eastAsia="Times New Roman" w:hAnsi="Times New Roman" w:cs="Times New Roman"/>
+          <w:noProof/>
           <w:sz w:val="27"/>
           <w:szCs w:val="27"/>
           <w:lang w:val="en-US" w:eastAsia="en-IN"/>
@@ -2349,6 +2371,7 @@
       <w:r>
         <w:rPr>
           <w:rFonts w:ascii="Times New Roman" w:eastAsia="Times New Roman" w:hAnsi="Times New Roman" w:cs="Times New Roman"/>
+          <w:noProof/>
           <w:sz w:val="27"/>
           <w:szCs w:val="27"/>
           <w:lang w:val="en-US" w:eastAsia="en-IN"/>
@@ -2483,12 +2506,13 @@
       <w:r>
         <w:rPr>
           <w:rFonts w:ascii="Times New Roman" w:eastAsia="Times New Roman" w:hAnsi="Times New Roman" w:cs="Times New Roman"/>
+          <w:noProof/>
           <w:sz w:val="27"/>
           <w:szCs w:val="27"/>
           <w:lang w:val="en-US" w:eastAsia="en-IN"/>
         </w:rPr>
         <w:drawing>
-          <wp:inline distT="0" distB="0" distL="0" distR="0" wp14:anchorId="21977839" wp14:editId="4527E438">
+          <wp:inline distT="0" distB="0" distL="0" distR="0" wp14:anchorId="21977839" wp14:editId="6D47795D">
             <wp:extent cx="5731510" cy="3820795"/>
             <wp:effectExtent l="0" t="0" r="2540" b="8255"/>
             <wp:docPr id="21" name="Picture 21"/>
@@ -2551,13 +2575,14 @@
       <w:r>
         <w:rPr>
           <w:rFonts w:ascii="Times New Roman" w:eastAsia="Times New Roman" w:hAnsi="Times New Roman" w:cs="Times New Roman"/>
+          <w:noProof/>
           <w:sz w:val="27"/>
           <w:szCs w:val="27"/>
           <w:lang w:val="en-US" w:eastAsia="en-IN"/>
         </w:rPr>
         <w:lastRenderedPageBreak/>
         <w:drawing>
-          <wp:inline distT="0" distB="0" distL="0" distR="0" wp14:anchorId="4AEBE132" wp14:editId="711EC992">
+          <wp:inline distT="0" distB="0" distL="0" distR="0" wp14:anchorId="4AEBE132" wp14:editId="0D5ABE69">
             <wp:extent cx="5731510" cy="4186555"/>
             <wp:effectExtent l="0" t="0" r="2540" b="4445"/>
             <wp:docPr id="20" name="Picture 20"/>
@@ -2620,12 +2645,13 @@
       <w:r>
         <w:rPr>
           <w:rFonts w:ascii="Times New Roman" w:eastAsia="Times New Roman" w:hAnsi="Times New Roman" w:cs="Times New Roman"/>
+          <w:noProof/>
           <w:sz w:val="27"/>
           <w:szCs w:val="27"/>
           <w:lang w:val="en-US" w:eastAsia="en-IN"/>
         </w:rPr>
         <w:drawing>
-          <wp:inline distT="0" distB="0" distL="0" distR="0" wp14:anchorId="562B27BC" wp14:editId="46CAE778">
+          <wp:inline distT="0" distB="0" distL="0" distR="0" wp14:anchorId="562B27BC" wp14:editId="605A9032">
             <wp:extent cx="5731510" cy="3829050"/>
             <wp:effectExtent l="0" t="0" r="2540" b="0"/>
             <wp:docPr id="19" name="Picture 19"/>
@@ -2754,6 +2780,7 @@
       <w:r>
         <w:rPr>
           <w:rFonts w:ascii="Times New Roman" w:eastAsia="Times New Roman" w:hAnsi="Times New Roman" w:cs="Times New Roman"/>
+          <w:noProof/>
           <w:sz w:val="27"/>
           <w:szCs w:val="27"/>
           <w:lang w:val="en-US" w:eastAsia="en-IN"/>
@@ -2822,6 +2849,7 @@
       <w:r>
         <w:rPr>
           <w:rFonts w:ascii="Times New Roman" w:eastAsia="Times New Roman" w:hAnsi="Times New Roman" w:cs="Times New Roman"/>
+          <w:noProof/>
           <w:sz w:val="27"/>
           <w:szCs w:val="27"/>
           <w:lang w:val="en-US" w:eastAsia="en-IN"/>
@@ -2891,12 +2919,13 @@
       <w:r>
         <w:rPr>
           <w:rFonts w:ascii="Times New Roman" w:eastAsia="Times New Roman" w:hAnsi="Times New Roman" w:cs="Times New Roman"/>
+          <w:noProof/>
           <w:sz w:val="27"/>
           <w:szCs w:val="27"/>
           <w:lang w:val="en-US" w:eastAsia="en-IN"/>
         </w:rPr>
         <w:drawing>
-          <wp:inline distT="0" distB="0" distL="0" distR="0" wp14:anchorId="41C6BF50" wp14:editId="3F1D02C7">
+          <wp:inline distT="0" distB="0" distL="0" distR="0" wp14:anchorId="41C6BF50" wp14:editId="3B9F10F6">
             <wp:extent cx="5731510" cy="3887470"/>
             <wp:effectExtent l="0" t="0" r="2540" b="0"/>
             <wp:docPr id="16" name="Picture 16"/>
@@ -3025,6 +3054,7 @@
       <w:r>
         <w:rPr>
           <w:rFonts w:ascii="Times New Roman" w:eastAsia="Times New Roman" w:hAnsi="Times New Roman" w:cs="Times New Roman"/>
+          <w:noProof/>
           <w:sz w:val="27"/>
           <w:szCs w:val="27"/>
           <w:lang w:val="en-US" w:eastAsia="en-IN"/>
@@ -3111,6 +3141,7 @@
       <w:r>
         <w:rPr>
           <w:rFonts w:ascii="Times New Roman" w:eastAsia="Times New Roman" w:hAnsi="Times New Roman" w:cs="Times New Roman"/>
+          <w:noProof/>
           <w:sz w:val="27"/>
           <w:szCs w:val="27"/>
           <w:lang w:val="en-US" w:eastAsia="en-IN"/>
@@ -3179,6 +3210,7 @@
       <w:r>
         <w:rPr>
           <w:rFonts w:ascii="Times New Roman" w:eastAsia="Times New Roman" w:hAnsi="Times New Roman" w:cs="Times New Roman"/>
+          <w:noProof/>
           <w:sz w:val="27"/>
           <w:szCs w:val="27"/>
           <w:lang w:val="en-US" w:eastAsia="en-IN"/>
@@ -3474,7 +3506,4630 @@
         </w:rPr>
       </w:pPr>
     </w:p>
+    <w:p>
+      <w:r>
+        <w:t xml:space="preserve">Vision and mission </w:t>
+      </w:r>
+    </w:p>
     <w:p/>
+    <w:p/>
+    <w:p>
+      <w:r>
+        <w:t>Vision</w:t>
+      </w:r>
+    </w:p>
+    <w:p>
+      <w:r>
+        <w:t>To become a trusted healthcare institution delivering world-class, ethical, and compassionate medical care to semi-urban and rural communities.</w:t>
+      </w:r>
+    </w:p>
+    <w:p/>
+    <w:p>
+      <w:r>
+        <w:t>Guided by the values of Shan Group, we envision a future where quality healthcare is accessible, affordable, and available close to home for every individual, regardless of their location or financial background.</w:t>
+      </w:r>
+    </w:p>
+    <w:p/>
+    <w:p>
+      <w:r>
+        <w:t xml:space="preserve">Our long-term vision is to build a network of modern hospitals and healthcare </w:t>
+      </w:r>
+      <w:proofErr w:type="spellStart"/>
+      <w:r>
+        <w:t>centers</w:t>
+      </w:r>
+      <w:proofErr w:type="spellEnd"/>
+      <w:r>
+        <w:t xml:space="preserve"> that bridge the gap between advanced medical technology and underserved communities across India.</w:t>
+      </w:r>
+    </w:p>
+    <w:p/>
+    <w:p>
+      <w:r>
+        <w:t>Mission</w:t>
+      </w:r>
+    </w:p>
+    <w:p>
+      <w:r>
+        <w:t>Affordable Quality Care</w:t>
+      </w:r>
+    </w:p>
+    <w:p>
+      <w:r>
+        <w:t>To provide high-quality medical services with modern infrastructure and advanced technology at an affordable cost for people in semi-urban and rural areas.</w:t>
+      </w:r>
+    </w:p>
+    <w:p/>
+    <w:p>
+      <w:r>
+        <w:t>Patient-Centric Healthcare</w:t>
+      </w:r>
+    </w:p>
+    <w:p>
+      <w:r>
+        <w:t>To deliver compassionate, ethical, and patient-focused treatment with dignity, transparency, and respect.</w:t>
+      </w:r>
+    </w:p>
+    <w:p/>
+    <w:p>
+      <w:r>
+        <w:t>Rural Healthcare Empowerment</w:t>
+      </w:r>
+    </w:p>
+    <w:p>
+      <w:r>
+        <w:t>To strengthen healthcare access for surrounding rural communities through preventive care, diagnostics, and specialized medical services.</w:t>
+      </w:r>
+    </w:p>
+    <w:p/>
+    <w:p>
+      <w:r>
+        <w:lastRenderedPageBreak/>
+        <w:t>Medical Excellence</w:t>
+      </w:r>
+    </w:p>
+    <w:p>
+      <w:r>
+        <w:t>To maintain the highest standards in clinical practices, supported by modern equipment, skilled doctors, and trained healthcare professionals.</w:t>
+      </w:r>
+    </w:p>
+    <w:p/>
+    <w:p>
+      <w:r>
+        <w:t>Community &amp; Social Responsibility</w:t>
+      </w:r>
+    </w:p>
+    <w:p>
+      <w:r>
+        <w:t>As part of Shan Group’s commitment to social responsibility, we aim to contribute to community well-being through health awareness programs, camps, and outreach initiatives.</w:t>
+      </w:r>
+    </w:p>
+    <w:p/>
+    <w:p>
+      <w:r>
+        <w:t>Future Expansion</w:t>
+      </w:r>
+    </w:p>
+    <w:p>
+      <w:r>
+        <w:t>To progressively establish more hospitals and healthcare facilities in underserved regions, ensuring that quality healthcare reaches every corner of society.</w:t>
+      </w:r>
+    </w:p>
+    <w:p/>
+    <w:p/>
+    <w:p>
+      <w:proofErr w:type="spellStart"/>
+      <w:r>
+        <w:rPr>
+          <w:rFonts w:ascii="Nirmala UI" w:hAnsi="Nirmala UI" w:cs="Nirmala UI"/>
+        </w:rPr>
+        <w:t>विज़न</w:t>
+      </w:r>
+      <w:proofErr w:type="spellEnd"/>
+      <w:r>
+        <w:t xml:space="preserve"> (Vision)</w:t>
+      </w:r>
+    </w:p>
+    <w:p/>
+    <w:p>
+      <w:proofErr w:type="spellStart"/>
+      <w:r>
+        <w:rPr>
+          <w:rFonts w:ascii="Nirmala UI" w:hAnsi="Nirmala UI" w:cs="Nirmala UI"/>
+        </w:rPr>
+        <w:t>हमारा</w:t>
+      </w:r>
+      <w:proofErr w:type="spellEnd"/>
+      <w:r>
+        <w:t xml:space="preserve"> </w:t>
+      </w:r>
+      <w:proofErr w:type="spellStart"/>
+      <w:r>
+        <w:rPr>
+          <w:rFonts w:ascii="Nirmala UI" w:hAnsi="Nirmala UI" w:cs="Nirmala UI"/>
+        </w:rPr>
+        <w:t>लक्ष्य</w:t>
+      </w:r>
+      <w:proofErr w:type="spellEnd"/>
+      <w:r>
+        <w:t xml:space="preserve"> </w:t>
+      </w:r>
+      <w:proofErr w:type="spellStart"/>
+      <w:r>
+        <w:rPr>
+          <w:rFonts w:ascii="Nirmala UI" w:hAnsi="Nirmala UI" w:cs="Nirmala UI"/>
+        </w:rPr>
+        <w:t>है</w:t>
+      </w:r>
+      <w:proofErr w:type="spellEnd"/>
+      <w:r>
+        <w:t xml:space="preserve"> </w:t>
+      </w:r>
+      <w:proofErr w:type="spellStart"/>
+      <w:r>
+        <w:rPr>
+          <w:rFonts w:ascii="Nirmala UI" w:hAnsi="Nirmala UI" w:cs="Nirmala UI"/>
+        </w:rPr>
+        <w:t>कि</w:t>
+      </w:r>
+      <w:proofErr w:type="spellEnd"/>
+      <w:r>
+        <w:t xml:space="preserve"> </w:t>
+      </w:r>
+      <w:proofErr w:type="spellStart"/>
+      <w:r>
+        <w:rPr>
+          <w:rFonts w:ascii="Nirmala UI" w:hAnsi="Nirmala UI" w:cs="Nirmala UI"/>
+        </w:rPr>
+        <w:t>हम</w:t>
+      </w:r>
+      <w:proofErr w:type="spellEnd"/>
+      <w:r>
+        <w:t xml:space="preserve"> </w:t>
+      </w:r>
+      <w:proofErr w:type="spellStart"/>
+      <w:r>
+        <w:rPr>
+          <w:rFonts w:ascii="Nirmala UI" w:hAnsi="Nirmala UI" w:cs="Nirmala UI"/>
+        </w:rPr>
+        <w:t>एक</w:t>
+      </w:r>
+      <w:proofErr w:type="spellEnd"/>
+      <w:r>
+        <w:t xml:space="preserve"> </w:t>
+      </w:r>
+      <w:proofErr w:type="spellStart"/>
+      <w:r>
+        <w:rPr>
+          <w:rFonts w:ascii="Nirmala UI" w:hAnsi="Nirmala UI" w:cs="Nirmala UI"/>
+        </w:rPr>
+        <w:t>भरोसेमंद</w:t>
+      </w:r>
+      <w:proofErr w:type="spellEnd"/>
+      <w:r>
+        <w:t xml:space="preserve"> </w:t>
+      </w:r>
+      <w:proofErr w:type="spellStart"/>
+      <w:r>
+        <w:rPr>
+          <w:rFonts w:ascii="Nirmala UI" w:hAnsi="Nirmala UI" w:cs="Nirmala UI"/>
+        </w:rPr>
+        <w:t>अस्पताल</w:t>
+      </w:r>
+      <w:proofErr w:type="spellEnd"/>
+      <w:r>
+        <w:t xml:space="preserve"> </w:t>
+      </w:r>
+      <w:proofErr w:type="spellStart"/>
+      <w:r>
+        <w:rPr>
+          <w:rFonts w:ascii="Nirmala UI" w:hAnsi="Nirmala UI" w:cs="Nirmala UI"/>
+        </w:rPr>
+        <w:t>बनें</w:t>
+      </w:r>
+      <w:proofErr w:type="spellEnd"/>
+      <w:r>
+        <w:t xml:space="preserve"> </w:t>
+      </w:r>
+      <w:proofErr w:type="spellStart"/>
+      <w:r>
+        <w:rPr>
+          <w:rFonts w:ascii="Nirmala UI" w:hAnsi="Nirmala UI" w:cs="Nirmala UI"/>
+        </w:rPr>
+        <w:t>जो</w:t>
+      </w:r>
+      <w:proofErr w:type="spellEnd"/>
+      <w:r>
+        <w:t xml:space="preserve"> </w:t>
+      </w:r>
+      <w:proofErr w:type="spellStart"/>
+      <w:r>
+        <w:rPr>
+          <w:rFonts w:ascii="Nirmala UI" w:hAnsi="Nirmala UI" w:cs="Nirmala UI"/>
+        </w:rPr>
+        <w:t>छोटे</w:t>
+      </w:r>
+      <w:proofErr w:type="spellEnd"/>
+      <w:r>
+        <w:t xml:space="preserve"> </w:t>
+      </w:r>
+      <w:proofErr w:type="spellStart"/>
+      <w:r>
+        <w:rPr>
+          <w:rFonts w:ascii="Nirmala UI" w:hAnsi="Nirmala UI" w:cs="Nirmala UI"/>
+        </w:rPr>
+        <w:t>शहरों</w:t>
+      </w:r>
+      <w:proofErr w:type="spellEnd"/>
+      <w:r>
+        <w:t xml:space="preserve"> </w:t>
+      </w:r>
+      <w:proofErr w:type="spellStart"/>
+      <w:r>
+        <w:rPr>
+          <w:rFonts w:ascii="Nirmala UI" w:hAnsi="Nirmala UI" w:cs="Nirmala UI"/>
+        </w:rPr>
+        <w:t>और</w:t>
+      </w:r>
+      <w:proofErr w:type="spellEnd"/>
+      <w:r>
+        <w:t xml:space="preserve"> </w:t>
+      </w:r>
+      <w:proofErr w:type="spellStart"/>
+      <w:r>
+        <w:rPr>
+          <w:rFonts w:ascii="Nirmala UI" w:hAnsi="Nirmala UI" w:cs="Nirmala UI"/>
+        </w:rPr>
+        <w:t>गांवों</w:t>
+      </w:r>
+      <w:proofErr w:type="spellEnd"/>
+      <w:r>
+        <w:t xml:space="preserve"> </w:t>
+      </w:r>
+      <w:proofErr w:type="spellStart"/>
+      <w:r>
+        <w:rPr>
+          <w:rFonts w:ascii="Nirmala UI" w:hAnsi="Nirmala UI" w:cs="Nirmala UI"/>
+        </w:rPr>
+        <w:t>के</w:t>
+      </w:r>
+      <w:proofErr w:type="spellEnd"/>
+      <w:r>
+        <w:t xml:space="preserve"> </w:t>
+      </w:r>
+      <w:proofErr w:type="spellStart"/>
+      <w:r>
+        <w:rPr>
+          <w:rFonts w:ascii="Nirmala UI" w:hAnsi="Nirmala UI" w:cs="Nirmala UI"/>
+        </w:rPr>
+        <w:t>लोगों</w:t>
+      </w:r>
+      <w:proofErr w:type="spellEnd"/>
+      <w:r>
+        <w:t xml:space="preserve"> </w:t>
+      </w:r>
+      <w:proofErr w:type="spellStart"/>
+      <w:r>
+        <w:rPr>
+          <w:rFonts w:ascii="Nirmala UI" w:hAnsi="Nirmala UI" w:cs="Nirmala UI"/>
+        </w:rPr>
+        <w:t>को</w:t>
+      </w:r>
+      <w:proofErr w:type="spellEnd"/>
+      <w:r>
+        <w:t xml:space="preserve"> </w:t>
+      </w:r>
+      <w:proofErr w:type="spellStart"/>
+      <w:r>
+        <w:rPr>
+          <w:rFonts w:ascii="Nirmala UI" w:hAnsi="Nirmala UI" w:cs="Nirmala UI"/>
+        </w:rPr>
+        <w:t>विश्व</w:t>
+      </w:r>
+      <w:r>
+        <w:t>-</w:t>
+      </w:r>
+      <w:r>
+        <w:rPr>
+          <w:rFonts w:ascii="Nirmala UI" w:hAnsi="Nirmala UI" w:cs="Nirmala UI"/>
+        </w:rPr>
+        <w:t>स्तरीय</w:t>
+      </w:r>
+      <w:proofErr w:type="spellEnd"/>
+      <w:r>
+        <w:t xml:space="preserve">, </w:t>
+      </w:r>
+      <w:proofErr w:type="spellStart"/>
+      <w:r>
+        <w:rPr>
+          <w:rFonts w:ascii="Nirmala UI" w:hAnsi="Nirmala UI" w:cs="Nirmala UI"/>
+        </w:rPr>
+        <w:t>ईमानदार</w:t>
+      </w:r>
+      <w:proofErr w:type="spellEnd"/>
+      <w:r>
+        <w:t xml:space="preserve"> </w:t>
+      </w:r>
+      <w:proofErr w:type="spellStart"/>
+      <w:r>
+        <w:rPr>
+          <w:rFonts w:ascii="Nirmala UI" w:hAnsi="Nirmala UI" w:cs="Nirmala UI"/>
+        </w:rPr>
+        <w:t>और</w:t>
+      </w:r>
+      <w:proofErr w:type="spellEnd"/>
+      <w:r>
+        <w:t xml:space="preserve"> </w:t>
+      </w:r>
+      <w:proofErr w:type="spellStart"/>
+      <w:r>
+        <w:rPr>
+          <w:rFonts w:ascii="Nirmala UI" w:hAnsi="Nirmala UI" w:cs="Nirmala UI"/>
+        </w:rPr>
+        <w:t>इंसानियत</w:t>
+      </w:r>
+      <w:proofErr w:type="spellEnd"/>
+      <w:r>
+        <w:t xml:space="preserve"> </w:t>
+      </w:r>
+      <w:proofErr w:type="spellStart"/>
+      <w:r>
+        <w:rPr>
+          <w:rFonts w:ascii="Nirmala UI" w:hAnsi="Nirmala UI" w:cs="Nirmala UI"/>
+        </w:rPr>
+        <w:t>से</w:t>
+      </w:r>
+      <w:proofErr w:type="spellEnd"/>
+      <w:r>
+        <w:t xml:space="preserve"> </w:t>
+      </w:r>
+      <w:proofErr w:type="spellStart"/>
+      <w:r>
+        <w:rPr>
+          <w:rFonts w:ascii="Nirmala UI" w:hAnsi="Nirmala UI" w:cs="Nirmala UI"/>
+        </w:rPr>
+        <w:t>भरी</w:t>
+      </w:r>
+      <w:proofErr w:type="spellEnd"/>
+      <w:r>
+        <w:t xml:space="preserve"> </w:t>
+      </w:r>
+      <w:proofErr w:type="spellStart"/>
+      <w:r>
+        <w:rPr>
+          <w:rFonts w:ascii="Nirmala UI" w:hAnsi="Nirmala UI" w:cs="Nirmala UI"/>
+        </w:rPr>
+        <w:t>स्वास्थ्य</w:t>
+      </w:r>
+      <w:proofErr w:type="spellEnd"/>
+      <w:r>
+        <w:t xml:space="preserve"> </w:t>
+      </w:r>
+      <w:proofErr w:type="spellStart"/>
+      <w:r>
+        <w:rPr>
+          <w:rFonts w:ascii="Nirmala UI" w:hAnsi="Nirmala UI" w:cs="Nirmala UI"/>
+        </w:rPr>
+        <w:t>सेवाएँ</w:t>
+      </w:r>
+      <w:proofErr w:type="spellEnd"/>
+      <w:r>
+        <w:t xml:space="preserve"> </w:t>
+      </w:r>
+      <w:proofErr w:type="spellStart"/>
+      <w:r>
+        <w:rPr>
+          <w:rFonts w:ascii="Nirmala UI" w:hAnsi="Nirmala UI" w:cs="Nirmala UI"/>
+        </w:rPr>
+        <w:t>दे</w:t>
+      </w:r>
+      <w:proofErr w:type="spellEnd"/>
+      <w:r>
+        <w:t xml:space="preserve"> </w:t>
+      </w:r>
+      <w:proofErr w:type="spellStart"/>
+      <w:r>
+        <w:rPr>
+          <w:rFonts w:ascii="Nirmala UI" w:hAnsi="Nirmala UI" w:cs="Nirmala UI"/>
+        </w:rPr>
+        <w:t>सके</w:t>
+      </w:r>
+      <w:proofErr w:type="spellEnd"/>
+      <w:r>
+        <w:rPr>
+          <w:rFonts w:ascii="Nirmala UI" w:hAnsi="Nirmala UI" w:cs="Nirmala UI"/>
+        </w:rPr>
+        <w:t>।</w:t>
+      </w:r>
+    </w:p>
+    <w:p/>
+    <w:p>
+      <w:r>
+        <w:t xml:space="preserve">Shan Group </w:t>
+      </w:r>
+      <w:proofErr w:type="spellStart"/>
+      <w:r>
+        <w:rPr>
+          <w:rFonts w:ascii="Nirmala UI" w:hAnsi="Nirmala UI" w:cs="Nirmala UI"/>
+        </w:rPr>
+        <w:t>के</w:t>
+      </w:r>
+      <w:proofErr w:type="spellEnd"/>
+      <w:r>
+        <w:t xml:space="preserve"> </w:t>
+      </w:r>
+      <w:proofErr w:type="spellStart"/>
+      <w:r>
+        <w:rPr>
+          <w:rFonts w:ascii="Nirmala UI" w:hAnsi="Nirmala UI" w:cs="Nirmala UI"/>
+        </w:rPr>
+        <w:t>मूल्यों</w:t>
+      </w:r>
+      <w:proofErr w:type="spellEnd"/>
+      <w:r>
+        <w:t xml:space="preserve"> </w:t>
+      </w:r>
+      <w:proofErr w:type="spellStart"/>
+      <w:r>
+        <w:rPr>
+          <w:rFonts w:ascii="Nirmala UI" w:hAnsi="Nirmala UI" w:cs="Nirmala UI"/>
+        </w:rPr>
+        <w:t>से</w:t>
+      </w:r>
+      <w:proofErr w:type="spellEnd"/>
+      <w:r>
+        <w:t xml:space="preserve"> </w:t>
+      </w:r>
+      <w:proofErr w:type="spellStart"/>
+      <w:r>
+        <w:rPr>
+          <w:rFonts w:ascii="Nirmala UI" w:hAnsi="Nirmala UI" w:cs="Nirmala UI"/>
+        </w:rPr>
+        <w:t>प्रेरित</w:t>
+      </w:r>
+      <w:proofErr w:type="spellEnd"/>
+      <w:r>
+        <w:t xml:space="preserve"> </w:t>
+      </w:r>
+      <w:proofErr w:type="spellStart"/>
+      <w:r>
+        <w:rPr>
+          <w:rFonts w:ascii="Nirmala UI" w:hAnsi="Nirmala UI" w:cs="Nirmala UI"/>
+        </w:rPr>
+        <w:t>होकर</w:t>
+      </w:r>
+      <w:proofErr w:type="spellEnd"/>
+      <w:r>
+        <w:t xml:space="preserve"> </w:t>
+      </w:r>
+      <w:proofErr w:type="spellStart"/>
+      <w:r>
+        <w:rPr>
+          <w:rFonts w:ascii="Nirmala UI" w:hAnsi="Nirmala UI" w:cs="Nirmala UI"/>
+        </w:rPr>
+        <w:t>हम</w:t>
+      </w:r>
+      <w:proofErr w:type="spellEnd"/>
+      <w:r>
+        <w:t xml:space="preserve"> </w:t>
+      </w:r>
+      <w:proofErr w:type="spellStart"/>
+      <w:r>
+        <w:rPr>
+          <w:rFonts w:ascii="Nirmala UI" w:hAnsi="Nirmala UI" w:cs="Nirmala UI"/>
+        </w:rPr>
+        <w:t>ऐसा</w:t>
+      </w:r>
+      <w:proofErr w:type="spellEnd"/>
+      <w:r>
+        <w:t xml:space="preserve"> </w:t>
+      </w:r>
+      <w:proofErr w:type="spellStart"/>
+      <w:r>
+        <w:rPr>
+          <w:rFonts w:ascii="Nirmala UI" w:hAnsi="Nirmala UI" w:cs="Nirmala UI"/>
+        </w:rPr>
+        <w:t>भविष्य</w:t>
+      </w:r>
+      <w:proofErr w:type="spellEnd"/>
+      <w:r>
+        <w:t xml:space="preserve"> </w:t>
+      </w:r>
+      <w:proofErr w:type="spellStart"/>
+      <w:r>
+        <w:rPr>
+          <w:rFonts w:ascii="Nirmala UI" w:hAnsi="Nirmala UI" w:cs="Nirmala UI"/>
+        </w:rPr>
+        <w:t>बनाना</w:t>
+      </w:r>
+      <w:proofErr w:type="spellEnd"/>
+      <w:r>
+        <w:t xml:space="preserve"> </w:t>
+      </w:r>
+      <w:proofErr w:type="spellStart"/>
+      <w:r>
+        <w:rPr>
+          <w:rFonts w:ascii="Nirmala UI" w:hAnsi="Nirmala UI" w:cs="Nirmala UI"/>
+        </w:rPr>
+        <w:t>चाहते</w:t>
+      </w:r>
+      <w:proofErr w:type="spellEnd"/>
+      <w:r>
+        <w:t xml:space="preserve"> </w:t>
+      </w:r>
+      <w:proofErr w:type="spellStart"/>
+      <w:r>
+        <w:rPr>
+          <w:rFonts w:ascii="Nirmala UI" w:hAnsi="Nirmala UI" w:cs="Nirmala UI"/>
+        </w:rPr>
+        <w:t>हैं</w:t>
+      </w:r>
+      <w:proofErr w:type="spellEnd"/>
+      <w:r>
+        <w:t xml:space="preserve"> </w:t>
+      </w:r>
+      <w:proofErr w:type="spellStart"/>
+      <w:r>
+        <w:rPr>
+          <w:rFonts w:ascii="Nirmala UI" w:hAnsi="Nirmala UI" w:cs="Nirmala UI"/>
+        </w:rPr>
+        <w:t>जहाँ</w:t>
+      </w:r>
+      <w:proofErr w:type="spellEnd"/>
+      <w:r>
+        <w:t xml:space="preserve"> </w:t>
+      </w:r>
+      <w:proofErr w:type="spellStart"/>
+      <w:r>
+        <w:rPr>
+          <w:rFonts w:ascii="Nirmala UI" w:hAnsi="Nirmala UI" w:cs="Nirmala UI"/>
+        </w:rPr>
+        <w:t>हर</w:t>
+      </w:r>
+      <w:proofErr w:type="spellEnd"/>
+      <w:r>
+        <w:t xml:space="preserve"> </w:t>
+      </w:r>
+      <w:proofErr w:type="spellStart"/>
+      <w:r>
+        <w:rPr>
+          <w:rFonts w:ascii="Nirmala UI" w:hAnsi="Nirmala UI" w:cs="Nirmala UI"/>
+        </w:rPr>
+        <w:t>व्यक्ति</w:t>
+      </w:r>
+      <w:proofErr w:type="spellEnd"/>
+      <w:r>
+        <w:t xml:space="preserve"> </w:t>
+      </w:r>
+      <w:proofErr w:type="spellStart"/>
+      <w:r>
+        <w:rPr>
+          <w:rFonts w:ascii="Nirmala UI" w:hAnsi="Nirmala UI" w:cs="Nirmala UI"/>
+        </w:rPr>
+        <w:t>को</w:t>
+      </w:r>
+      <w:proofErr w:type="spellEnd"/>
+      <w:r>
+        <w:t xml:space="preserve">, </w:t>
+      </w:r>
+      <w:proofErr w:type="spellStart"/>
+      <w:r>
+        <w:rPr>
+          <w:rFonts w:ascii="Nirmala UI" w:hAnsi="Nirmala UI" w:cs="Nirmala UI"/>
+        </w:rPr>
+        <w:t>चाहे</w:t>
+      </w:r>
+      <w:proofErr w:type="spellEnd"/>
+      <w:r>
+        <w:t xml:space="preserve"> </w:t>
+      </w:r>
+      <w:proofErr w:type="spellStart"/>
+      <w:r>
+        <w:rPr>
+          <w:rFonts w:ascii="Nirmala UI" w:hAnsi="Nirmala UI" w:cs="Nirmala UI"/>
+        </w:rPr>
+        <w:t>वह</w:t>
+      </w:r>
+      <w:proofErr w:type="spellEnd"/>
+      <w:r>
+        <w:t xml:space="preserve"> </w:t>
+      </w:r>
+      <w:proofErr w:type="spellStart"/>
+      <w:r>
+        <w:rPr>
+          <w:rFonts w:ascii="Nirmala UI" w:hAnsi="Nirmala UI" w:cs="Nirmala UI"/>
+        </w:rPr>
+        <w:t>किसी</w:t>
+      </w:r>
+      <w:proofErr w:type="spellEnd"/>
+      <w:r>
+        <w:t xml:space="preserve"> </w:t>
+      </w:r>
+      <w:proofErr w:type="spellStart"/>
+      <w:r>
+        <w:rPr>
+          <w:rFonts w:ascii="Nirmala UI" w:hAnsi="Nirmala UI" w:cs="Nirmala UI"/>
+        </w:rPr>
+        <w:t>भी</w:t>
+      </w:r>
+      <w:proofErr w:type="spellEnd"/>
+      <w:r>
+        <w:t xml:space="preserve"> </w:t>
+      </w:r>
+      <w:proofErr w:type="spellStart"/>
+      <w:r>
+        <w:rPr>
+          <w:rFonts w:ascii="Nirmala UI" w:hAnsi="Nirmala UI" w:cs="Nirmala UI"/>
+        </w:rPr>
+        <w:t>गांव</w:t>
+      </w:r>
+      <w:proofErr w:type="spellEnd"/>
+      <w:r>
+        <w:t xml:space="preserve">, </w:t>
+      </w:r>
+      <w:proofErr w:type="spellStart"/>
+      <w:r>
+        <w:rPr>
+          <w:rFonts w:ascii="Nirmala UI" w:hAnsi="Nirmala UI" w:cs="Nirmala UI"/>
+        </w:rPr>
+        <w:t>कस्बे</w:t>
+      </w:r>
+      <w:proofErr w:type="spellEnd"/>
+      <w:r>
+        <w:t xml:space="preserve"> </w:t>
+      </w:r>
+      <w:proofErr w:type="spellStart"/>
+      <w:r>
+        <w:rPr>
+          <w:rFonts w:ascii="Nirmala UI" w:hAnsi="Nirmala UI" w:cs="Nirmala UI"/>
+        </w:rPr>
+        <w:t>या</w:t>
+      </w:r>
+      <w:proofErr w:type="spellEnd"/>
+      <w:r>
+        <w:t xml:space="preserve"> </w:t>
+      </w:r>
+      <w:proofErr w:type="spellStart"/>
+      <w:r>
+        <w:rPr>
+          <w:rFonts w:ascii="Nirmala UI" w:hAnsi="Nirmala UI" w:cs="Nirmala UI"/>
+        </w:rPr>
+        <w:t>आर्थिक</w:t>
+      </w:r>
+      <w:proofErr w:type="spellEnd"/>
+      <w:r>
+        <w:t xml:space="preserve"> </w:t>
+      </w:r>
+      <w:proofErr w:type="spellStart"/>
+      <w:r>
+        <w:rPr>
+          <w:rFonts w:ascii="Nirmala UI" w:hAnsi="Nirmala UI" w:cs="Nirmala UI"/>
+        </w:rPr>
+        <w:t>स्थिति</w:t>
+      </w:r>
+      <w:proofErr w:type="spellEnd"/>
+      <w:r>
+        <w:t xml:space="preserve"> </w:t>
+      </w:r>
+      <w:proofErr w:type="spellStart"/>
+      <w:r>
+        <w:rPr>
+          <w:rFonts w:ascii="Nirmala UI" w:hAnsi="Nirmala UI" w:cs="Nirmala UI"/>
+        </w:rPr>
+        <w:t>से</w:t>
+      </w:r>
+      <w:proofErr w:type="spellEnd"/>
+      <w:r>
+        <w:t xml:space="preserve"> </w:t>
+      </w:r>
+      <w:proofErr w:type="spellStart"/>
+      <w:r>
+        <w:rPr>
+          <w:rFonts w:ascii="Nirmala UI" w:hAnsi="Nirmala UI" w:cs="Nirmala UI"/>
+        </w:rPr>
+        <w:t>हो</w:t>
+      </w:r>
+      <w:proofErr w:type="spellEnd"/>
+      <w:r>
+        <w:t xml:space="preserve">, </w:t>
+      </w:r>
+      <w:proofErr w:type="spellStart"/>
+      <w:r>
+        <w:rPr>
+          <w:rFonts w:ascii="Nirmala UI" w:hAnsi="Nirmala UI" w:cs="Nirmala UI"/>
+        </w:rPr>
+        <w:t>अच्छा</w:t>
+      </w:r>
+      <w:proofErr w:type="spellEnd"/>
+      <w:r>
+        <w:t xml:space="preserve"> </w:t>
+      </w:r>
+      <w:proofErr w:type="spellStart"/>
+      <w:r>
+        <w:rPr>
+          <w:rFonts w:ascii="Nirmala UI" w:hAnsi="Nirmala UI" w:cs="Nirmala UI"/>
+        </w:rPr>
+        <w:t>इलाज</w:t>
+      </w:r>
+      <w:proofErr w:type="spellEnd"/>
+      <w:r>
+        <w:t xml:space="preserve"> </w:t>
+      </w:r>
+      <w:proofErr w:type="spellStart"/>
+      <w:r>
+        <w:rPr>
+          <w:rFonts w:ascii="Nirmala UI" w:hAnsi="Nirmala UI" w:cs="Nirmala UI"/>
+        </w:rPr>
+        <w:t>आसानी</w:t>
+      </w:r>
+      <w:proofErr w:type="spellEnd"/>
+      <w:r>
+        <w:t xml:space="preserve"> </w:t>
+      </w:r>
+      <w:proofErr w:type="spellStart"/>
+      <w:r>
+        <w:rPr>
+          <w:rFonts w:ascii="Nirmala UI" w:hAnsi="Nirmala UI" w:cs="Nirmala UI"/>
+        </w:rPr>
+        <w:t>से</w:t>
+      </w:r>
+      <w:proofErr w:type="spellEnd"/>
+      <w:r>
+        <w:t xml:space="preserve">, </w:t>
+      </w:r>
+      <w:proofErr w:type="spellStart"/>
+      <w:r>
+        <w:rPr>
+          <w:rFonts w:ascii="Nirmala UI" w:hAnsi="Nirmala UI" w:cs="Nirmala UI"/>
+        </w:rPr>
+        <w:t>सही</w:t>
+      </w:r>
+      <w:proofErr w:type="spellEnd"/>
+      <w:r>
+        <w:t xml:space="preserve"> </w:t>
+      </w:r>
+      <w:proofErr w:type="spellStart"/>
+      <w:r>
+        <w:rPr>
+          <w:rFonts w:ascii="Nirmala UI" w:hAnsi="Nirmala UI" w:cs="Nirmala UI"/>
+        </w:rPr>
+        <w:t>कीमत</w:t>
+      </w:r>
+      <w:proofErr w:type="spellEnd"/>
+      <w:r>
+        <w:t xml:space="preserve"> </w:t>
+      </w:r>
+      <w:proofErr w:type="spellStart"/>
+      <w:r>
+        <w:rPr>
+          <w:rFonts w:ascii="Nirmala UI" w:hAnsi="Nirmala UI" w:cs="Nirmala UI"/>
+        </w:rPr>
+        <w:t>पर</w:t>
+      </w:r>
+      <w:proofErr w:type="spellEnd"/>
+      <w:r>
+        <w:t xml:space="preserve"> </w:t>
+      </w:r>
+      <w:proofErr w:type="spellStart"/>
+      <w:r>
+        <w:rPr>
+          <w:rFonts w:ascii="Nirmala UI" w:hAnsi="Nirmala UI" w:cs="Nirmala UI"/>
+        </w:rPr>
+        <w:t>और</w:t>
+      </w:r>
+      <w:proofErr w:type="spellEnd"/>
+      <w:r>
+        <w:t xml:space="preserve"> </w:t>
+      </w:r>
+      <w:proofErr w:type="spellStart"/>
+      <w:r>
+        <w:rPr>
+          <w:rFonts w:ascii="Nirmala UI" w:hAnsi="Nirmala UI" w:cs="Nirmala UI"/>
+        </w:rPr>
+        <w:t>अपने</w:t>
+      </w:r>
+      <w:proofErr w:type="spellEnd"/>
+      <w:r>
+        <w:t xml:space="preserve"> </w:t>
+      </w:r>
+      <w:proofErr w:type="spellStart"/>
+      <w:r>
+        <w:rPr>
+          <w:rFonts w:ascii="Nirmala UI" w:hAnsi="Nirmala UI" w:cs="Nirmala UI"/>
+        </w:rPr>
+        <w:t>घर</w:t>
+      </w:r>
+      <w:proofErr w:type="spellEnd"/>
+      <w:r>
+        <w:t xml:space="preserve"> </w:t>
+      </w:r>
+      <w:proofErr w:type="spellStart"/>
+      <w:r>
+        <w:rPr>
+          <w:rFonts w:ascii="Nirmala UI" w:hAnsi="Nirmala UI" w:cs="Nirmala UI"/>
+        </w:rPr>
+        <w:t>के</w:t>
+      </w:r>
+      <w:proofErr w:type="spellEnd"/>
+      <w:r>
+        <w:t xml:space="preserve"> </w:t>
+      </w:r>
+      <w:proofErr w:type="spellStart"/>
+      <w:r>
+        <w:rPr>
+          <w:rFonts w:ascii="Nirmala UI" w:hAnsi="Nirmala UI" w:cs="Nirmala UI"/>
+        </w:rPr>
+        <w:t>पास</w:t>
+      </w:r>
+      <w:proofErr w:type="spellEnd"/>
+      <w:r>
+        <w:t xml:space="preserve"> </w:t>
+      </w:r>
+      <w:proofErr w:type="spellStart"/>
+      <w:r>
+        <w:rPr>
+          <w:rFonts w:ascii="Nirmala UI" w:hAnsi="Nirmala UI" w:cs="Nirmala UI"/>
+        </w:rPr>
+        <w:t>मिल</w:t>
+      </w:r>
+      <w:proofErr w:type="spellEnd"/>
+      <w:r>
+        <w:t xml:space="preserve"> </w:t>
+      </w:r>
+      <w:proofErr w:type="spellStart"/>
+      <w:r>
+        <w:rPr>
+          <w:rFonts w:ascii="Nirmala UI" w:hAnsi="Nirmala UI" w:cs="Nirmala UI"/>
+        </w:rPr>
+        <w:t>सके</w:t>
+      </w:r>
+      <w:proofErr w:type="spellEnd"/>
+      <w:r>
+        <w:rPr>
+          <w:rFonts w:ascii="Nirmala UI" w:hAnsi="Nirmala UI" w:cs="Nirmala UI"/>
+        </w:rPr>
+        <w:t>।</w:t>
+      </w:r>
+    </w:p>
+    <w:p/>
+    <w:p>
+      <w:proofErr w:type="spellStart"/>
+      <w:r>
+        <w:rPr>
+          <w:rFonts w:ascii="Nirmala UI" w:hAnsi="Nirmala UI" w:cs="Nirmala UI"/>
+        </w:rPr>
+        <w:t>हमारा</w:t>
+      </w:r>
+      <w:proofErr w:type="spellEnd"/>
+      <w:r>
+        <w:t xml:space="preserve"> </w:t>
+      </w:r>
+      <w:proofErr w:type="spellStart"/>
+      <w:r>
+        <w:rPr>
+          <w:rFonts w:ascii="Nirmala UI" w:hAnsi="Nirmala UI" w:cs="Nirmala UI"/>
+        </w:rPr>
+        <w:t>लम्बे</w:t>
+      </w:r>
+      <w:proofErr w:type="spellEnd"/>
+      <w:r>
+        <w:t xml:space="preserve"> </w:t>
+      </w:r>
+      <w:proofErr w:type="spellStart"/>
+      <w:r>
+        <w:rPr>
+          <w:rFonts w:ascii="Nirmala UI" w:hAnsi="Nirmala UI" w:cs="Nirmala UI"/>
+        </w:rPr>
+        <w:t>समय</w:t>
+      </w:r>
+      <w:proofErr w:type="spellEnd"/>
+      <w:r>
+        <w:t xml:space="preserve"> </w:t>
+      </w:r>
+      <w:proofErr w:type="spellStart"/>
+      <w:r>
+        <w:rPr>
+          <w:rFonts w:ascii="Nirmala UI" w:hAnsi="Nirmala UI" w:cs="Nirmala UI"/>
+        </w:rPr>
+        <w:t>का</w:t>
+      </w:r>
+      <w:proofErr w:type="spellEnd"/>
+      <w:r>
+        <w:t xml:space="preserve"> </w:t>
+      </w:r>
+      <w:proofErr w:type="spellStart"/>
+      <w:r>
+        <w:rPr>
+          <w:rFonts w:ascii="Nirmala UI" w:hAnsi="Nirmala UI" w:cs="Nirmala UI"/>
+        </w:rPr>
+        <w:t>सपना</w:t>
+      </w:r>
+      <w:proofErr w:type="spellEnd"/>
+      <w:r>
+        <w:t xml:space="preserve"> </w:t>
+      </w:r>
+      <w:proofErr w:type="spellStart"/>
+      <w:r>
+        <w:rPr>
+          <w:rFonts w:ascii="Nirmala UI" w:hAnsi="Nirmala UI" w:cs="Nirmala UI"/>
+        </w:rPr>
+        <w:t>है</w:t>
+      </w:r>
+      <w:proofErr w:type="spellEnd"/>
+      <w:r>
+        <w:t xml:space="preserve"> </w:t>
+      </w:r>
+      <w:proofErr w:type="spellStart"/>
+      <w:r>
+        <w:rPr>
+          <w:rFonts w:ascii="Nirmala UI" w:hAnsi="Nirmala UI" w:cs="Nirmala UI"/>
+        </w:rPr>
+        <w:t>कि</w:t>
+      </w:r>
+      <w:proofErr w:type="spellEnd"/>
+      <w:r>
+        <w:t xml:space="preserve"> </w:t>
+      </w:r>
+      <w:proofErr w:type="spellStart"/>
+      <w:r>
+        <w:rPr>
+          <w:rFonts w:ascii="Nirmala UI" w:hAnsi="Nirmala UI" w:cs="Nirmala UI"/>
+        </w:rPr>
+        <w:t>पूरे</w:t>
+      </w:r>
+      <w:proofErr w:type="spellEnd"/>
+      <w:r>
+        <w:t xml:space="preserve"> </w:t>
+      </w:r>
+      <w:proofErr w:type="spellStart"/>
+      <w:r>
+        <w:rPr>
+          <w:rFonts w:ascii="Nirmala UI" w:hAnsi="Nirmala UI" w:cs="Nirmala UI"/>
+        </w:rPr>
+        <w:t>भारत</w:t>
+      </w:r>
+      <w:proofErr w:type="spellEnd"/>
+      <w:r>
+        <w:t xml:space="preserve"> </w:t>
+      </w:r>
+      <w:proofErr w:type="spellStart"/>
+      <w:r>
+        <w:rPr>
+          <w:rFonts w:ascii="Nirmala UI" w:hAnsi="Nirmala UI" w:cs="Nirmala UI"/>
+        </w:rPr>
+        <w:t>में</w:t>
+      </w:r>
+      <w:proofErr w:type="spellEnd"/>
+      <w:r>
+        <w:t xml:space="preserve"> </w:t>
+      </w:r>
+      <w:proofErr w:type="spellStart"/>
+      <w:r>
+        <w:rPr>
+          <w:rFonts w:ascii="Nirmala UI" w:hAnsi="Nirmala UI" w:cs="Nirmala UI"/>
+        </w:rPr>
+        <w:t>आधुनिक</w:t>
+      </w:r>
+      <w:proofErr w:type="spellEnd"/>
+      <w:r>
+        <w:t xml:space="preserve"> </w:t>
+      </w:r>
+      <w:proofErr w:type="spellStart"/>
+      <w:r>
+        <w:rPr>
+          <w:rFonts w:ascii="Nirmala UI" w:hAnsi="Nirmala UI" w:cs="Nirmala UI"/>
+        </w:rPr>
+        <w:t>अस्पतालों</w:t>
+      </w:r>
+      <w:proofErr w:type="spellEnd"/>
+      <w:r>
+        <w:t xml:space="preserve"> </w:t>
+      </w:r>
+      <w:proofErr w:type="spellStart"/>
+      <w:r>
+        <w:rPr>
+          <w:rFonts w:ascii="Nirmala UI" w:hAnsi="Nirmala UI" w:cs="Nirmala UI"/>
+        </w:rPr>
+        <w:t>और</w:t>
+      </w:r>
+      <w:proofErr w:type="spellEnd"/>
+      <w:r>
+        <w:t xml:space="preserve"> </w:t>
+      </w:r>
+      <w:proofErr w:type="spellStart"/>
+      <w:r>
+        <w:rPr>
+          <w:rFonts w:ascii="Nirmala UI" w:hAnsi="Nirmala UI" w:cs="Nirmala UI"/>
+        </w:rPr>
+        <w:t>हेल्थकेयर</w:t>
+      </w:r>
+      <w:proofErr w:type="spellEnd"/>
+      <w:r>
+        <w:t xml:space="preserve"> </w:t>
+      </w:r>
+      <w:proofErr w:type="spellStart"/>
+      <w:r>
+        <w:rPr>
+          <w:rFonts w:ascii="Nirmala UI" w:hAnsi="Nirmala UI" w:cs="Nirmala UI"/>
+        </w:rPr>
+        <w:t>सेंटर</w:t>
+      </w:r>
+      <w:proofErr w:type="spellEnd"/>
+      <w:r>
+        <w:t xml:space="preserve"> </w:t>
+      </w:r>
+      <w:proofErr w:type="spellStart"/>
+      <w:r>
+        <w:rPr>
+          <w:rFonts w:ascii="Nirmala UI" w:hAnsi="Nirmala UI" w:cs="Nirmala UI"/>
+        </w:rPr>
+        <w:t>का</w:t>
+      </w:r>
+      <w:proofErr w:type="spellEnd"/>
+      <w:r>
+        <w:t xml:space="preserve"> </w:t>
+      </w:r>
+      <w:proofErr w:type="spellStart"/>
+      <w:r>
+        <w:rPr>
+          <w:rFonts w:ascii="Nirmala UI" w:hAnsi="Nirmala UI" w:cs="Nirmala UI"/>
+        </w:rPr>
+        <w:t>एक</w:t>
+      </w:r>
+      <w:proofErr w:type="spellEnd"/>
+      <w:r>
+        <w:t xml:space="preserve"> </w:t>
+      </w:r>
+      <w:proofErr w:type="spellStart"/>
+      <w:r>
+        <w:rPr>
+          <w:rFonts w:ascii="Nirmala UI" w:hAnsi="Nirmala UI" w:cs="Nirmala UI"/>
+        </w:rPr>
+        <w:t>मजबूत</w:t>
+      </w:r>
+      <w:proofErr w:type="spellEnd"/>
+      <w:r>
+        <w:t xml:space="preserve"> </w:t>
+      </w:r>
+      <w:proofErr w:type="spellStart"/>
+      <w:r>
+        <w:rPr>
+          <w:rFonts w:ascii="Nirmala UI" w:hAnsi="Nirmala UI" w:cs="Nirmala UI"/>
+        </w:rPr>
+        <w:t>नेटवर्क</w:t>
+      </w:r>
+      <w:proofErr w:type="spellEnd"/>
+      <w:r>
+        <w:t xml:space="preserve"> </w:t>
+      </w:r>
+      <w:proofErr w:type="spellStart"/>
+      <w:r>
+        <w:rPr>
+          <w:rFonts w:ascii="Nirmala UI" w:hAnsi="Nirmala UI" w:cs="Nirmala UI"/>
+        </w:rPr>
+        <w:t>बनाया</w:t>
+      </w:r>
+      <w:proofErr w:type="spellEnd"/>
+      <w:r>
+        <w:t xml:space="preserve"> </w:t>
+      </w:r>
+      <w:proofErr w:type="spellStart"/>
+      <w:r>
+        <w:rPr>
+          <w:rFonts w:ascii="Nirmala UI" w:hAnsi="Nirmala UI" w:cs="Nirmala UI"/>
+        </w:rPr>
+        <w:t>जाए</w:t>
+      </w:r>
+      <w:proofErr w:type="spellEnd"/>
+      <w:r>
+        <w:t xml:space="preserve">, </w:t>
+      </w:r>
+      <w:proofErr w:type="spellStart"/>
+      <w:r>
+        <w:rPr>
+          <w:rFonts w:ascii="Nirmala UI" w:hAnsi="Nirmala UI" w:cs="Nirmala UI"/>
+        </w:rPr>
+        <w:t>ताकि</w:t>
+      </w:r>
+      <w:proofErr w:type="spellEnd"/>
+      <w:r>
+        <w:t xml:space="preserve"> </w:t>
+      </w:r>
+      <w:proofErr w:type="spellStart"/>
+      <w:r>
+        <w:rPr>
+          <w:rFonts w:ascii="Nirmala UI" w:hAnsi="Nirmala UI" w:cs="Nirmala UI"/>
+        </w:rPr>
+        <w:t>नई</w:t>
+      </w:r>
+      <w:proofErr w:type="spellEnd"/>
+      <w:r>
+        <w:t xml:space="preserve"> </w:t>
+      </w:r>
+      <w:proofErr w:type="spellStart"/>
+      <w:r>
+        <w:rPr>
+          <w:rFonts w:ascii="Nirmala UI" w:hAnsi="Nirmala UI" w:cs="Nirmala UI"/>
+        </w:rPr>
+        <w:t>मेडिकल</w:t>
+      </w:r>
+      <w:proofErr w:type="spellEnd"/>
+      <w:r>
+        <w:t xml:space="preserve"> </w:t>
+      </w:r>
+      <w:proofErr w:type="spellStart"/>
+      <w:r>
+        <w:rPr>
+          <w:rFonts w:ascii="Nirmala UI" w:hAnsi="Nirmala UI" w:cs="Nirmala UI"/>
+        </w:rPr>
+        <w:t>तकनीक</w:t>
+      </w:r>
+      <w:proofErr w:type="spellEnd"/>
+      <w:r>
+        <w:t xml:space="preserve"> </w:t>
+      </w:r>
+      <w:proofErr w:type="spellStart"/>
+      <w:r>
+        <w:rPr>
+          <w:rFonts w:ascii="Nirmala UI" w:hAnsi="Nirmala UI" w:cs="Nirmala UI"/>
+        </w:rPr>
+        <w:t>और</w:t>
+      </w:r>
+      <w:proofErr w:type="spellEnd"/>
+      <w:r>
+        <w:t xml:space="preserve"> </w:t>
+      </w:r>
+      <w:proofErr w:type="spellStart"/>
+      <w:r>
+        <w:rPr>
+          <w:rFonts w:ascii="Nirmala UI" w:hAnsi="Nirmala UI" w:cs="Nirmala UI"/>
+        </w:rPr>
+        <w:t>अच्छे</w:t>
+      </w:r>
+      <w:proofErr w:type="spellEnd"/>
+      <w:r>
+        <w:t xml:space="preserve"> </w:t>
+      </w:r>
+      <w:proofErr w:type="spellStart"/>
+      <w:r>
+        <w:rPr>
+          <w:rFonts w:ascii="Nirmala UI" w:hAnsi="Nirmala UI" w:cs="Nirmala UI"/>
+        </w:rPr>
+        <w:t>इलाज</w:t>
+      </w:r>
+      <w:proofErr w:type="spellEnd"/>
+      <w:r>
+        <w:t xml:space="preserve"> </w:t>
+      </w:r>
+      <w:proofErr w:type="spellStart"/>
+      <w:r>
+        <w:rPr>
+          <w:rFonts w:ascii="Nirmala UI" w:hAnsi="Nirmala UI" w:cs="Nirmala UI"/>
+        </w:rPr>
+        <w:t>की</w:t>
+      </w:r>
+      <w:proofErr w:type="spellEnd"/>
+      <w:r>
+        <w:t xml:space="preserve"> </w:t>
+      </w:r>
+      <w:proofErr w:type="spellStart"/>
+      <w:r>
+        <w:rPr>
+          <w:rFonts w:ascii="Nirmala UI" w:hAnsi="Nirmala UI" w:cs="Nirmala UI"/>
+        </w:rPr>
+        <w:t>सुविधा</w:t>
+      </w:r>
+      <w:proofErr w:type="spellEnd"/>
+      <w:r>
+        <w:t xml:space="preserve"> </w:t>
+      </w:r>
+      <w:proofErr w:type="spellStart"/>
+      <w:r>
+        <w:rPr>
+          <w:rFonts w:ascii="Nirmala UI" w:hAnsi="Nirmala UI" w:cs="Nirmala UI"/>
+        </w:rPr>
+        <w:t>उन</w:t>
+      </w:r>
+      <w:proofErr w:type="spellEnd"/>
+      <w:r>
+        <w:t xml:space="preserve"> </w:t>
+      </w:r>
+      <w:proofErr w:type="spellStart"/>
+      <w:r>
+        <w:rPr>
+          <w:rFonts w:ascii="Nirmala UI" w:hAnsi="Nirmala UI" w:cs="Nirmala UI"/>
+        </w:rPr>
+        <w:t>इलाकों</w:t>
+      </w:r>
+      <w:proofErr w:type="spellEnd"/>
+      <w:r>
+        <w:t xml:space="preserve"> </w:t>
+      </w:r>
+      <w:proofErr w:type="spellStart"/>
+      <w:r>
+        <w:rPr>
+          <w:rFonts w:ascii="Nirmala UI" w:hAnsi="Nirmala UI" w:cs="Nirmala UI"/>
+        </w:rPr>
+        <w:t>तक</w:t>
+      </w:r>
+      <w:proofErr w:type="spellEnd"/>
+      <w:r>
+        <w:t xml:space="preserve"> </w:t>
+      </w:r>
+      <w:proofErr w:type="spellStart"/>
+      <w:r>
+        <w:rPr>
+          <w:rFonts w:ascii="Nirmala UI" w:hAnsi="Nirmala UI" w:cs="Nirmala UI"/>
+        </w:rPr>
+        <w:t>भी</w:t>
+      </w:r>
+      <w:proofErr w:type="spellEnd"/>
+      <w:r>
+        <w:t xml:space="preserve"> </w:t>
+      </w:r>
+      <w:proofErr w:type="spellStart"/>
+      <w:r>
+        <w:rPr>
+          <w:rFonts w:ascii="Nirmala UI" w:hAnsi="Nirmala UI" w:cs="Nirmala UI"/>
+        </w:rPr>
+        <w:t>पहुँचे</w:t>
+      </w:r>
+      <w:proofErr w:type="spellEnd"/>
+      <w:r>
+        <w:t xml:space="preserve"> </w:t>
+      </w:r>
+      <w:proofErr w:type="spellStart"/>
+      <w:r>
+        <w:rPr>
+          <w:rFonts w:ascii="Nirmala UI" w:hAnsi="Nirmala UI" w:cs="Nirmala UI"/>
+        </w:rPr>
+        <w:t>जहाँ</w:t>
+      </w:r>
+      <w:proofErr w:type="spellEnd"/>
+      <w:r>
+        <w:t xml:space="preserve"> </w:t>
+      </w:r>
+      <w:proofErr w:type="spellStart"/>
+      <w:r>
+        <w:rPr>
+          <w:rFonts w:ascii="Nirmala UI" w:hAnsi="Nirmala UI" w:cs="Nirmala UI"/>
+        </w:rPr>
+        <w:t>अभी</w:t>
+      </w:r>
+      <w:proofErr w:type="spellEnd"/>
+      <w:r>
+        <w:t xml:space="preserve"> </w:t>
+      </w:r>
+      <w:proofErr w:type="spellStart"/>
+      <w:r>
+        <w:rPr>
+          <w:rFonts w:ascii="Nirmala UI" w:hAnsi="Nirmala UI" w:cs="Nirmala UI"/>
+        </w:rPr>
+        <w:t>तक</w:t>
+      </w:r>
+      <w:proofErr w:type="spellEnd"/>
+      <w:r>
+        <w:t xml:space="preserve"> </w:t>
+      </w:r>
+      <w:proofErr w:type="spellStart"/>
+      <w:r>
+        <w:rPr>
+          <w:rFonts w:ascii="Nirmala UI" w:hAnsi="Nirmala UI" w:cs="Nirmala UI"/>
+        </w:rPr>
+        <w:t>सही</w:t>
+      </w:r>
+      <w:proofErr w:type="spellEnd"/>
+      <w:r>
+        <w:t xml:space="preserve"> </w:t>
+      </w:r>
+      <w:proofErr w:type="spellStart"/>
+      <w:r>
+        <w:rPr>
+          <w:rFonts w:ascii="Nirmala UI" w:hAnsi="Nirmala UI" w:cs="Nirmala UI"/>
+        </w:rPr>
+        <w:t>स्वास्थ्य</w:t>
+      </w:r>
+      <w:proofErr w:type="spellEnd"/>
+      <w:r>
+        <w:t xml:space="preserve"> </w:t>
+      </w:r>
+      <w:proofErr w:type="spellStart"/>
+      <w:r>
+        <w:rPr>
+          <w:rFonts w:ascii="Nirmala UI" w:hAnsi="Nirmala UI" w:cs="Nirmala UI"/>
+        </w:rPr>
+        <w:t>सेवाएँ</w:t>
+      </w:r>
+      <w:proofErr w:type="spellEnd"/>
+      <w:r>
+        <w:t xml:space="preserve"> </w:t>
+      </w:r>
+      <w:proofErr w:type="spellStart"/>
+      <w:r>
+        <w:rPr>
+          <w:rFonts w:ascii="Nirmala UI" w:hAnsi="Nirmala UI" w:cs="Nirmala UI"/>
+        </w:rPr>
+        <w:t>नहीं</w:t>
+      </w:r>
+      <w:proofErr w:type="spellEnd"/>
+      <w:r>
+        <w:t xml:space="preserve"> </w:t>
+      </w:r>
+      <w:proofErr w:type="spellStart"/>
+      <w:r>
+        <w:rPr>
+          <w:rFonts w:ascii="Nirmala UI" w:hAnsi="Nirmala UI" w:cs="Nirmala UI"/>
+        </w:rPr>
+        <w:t>पहुँच</w:t>
+      </w:r>
+      <w:proofErr w:type="spellEnd"/>
+      <w:r>
+        <w:t xml:space="preserve"> </w:t>
+      </w:r>
+      <w:proofErr w:type="spellStart"/>
+      <w:r>
+        <w:rPr>
+          <w:rFonts w:ascii="Nirmala UI" w:hAnsi="Nirmala UI" w:cs="Nirmala UI"/>
+        </w:rPr>
+        <w:t>पाई</w:t>
+      </w:r>
+      <w:proofErr w:type="spellEnd"/>
+      <w:r>
+        <w:t xml:space="preserve"> </w:t>
+      </w:r>
+      <w:proofErr w:type="spellStart"/>
+      <w:r>
+        <w:rPr>
+          <w:rFonts w:ascii="Nirmala UI" w:hAnsi="Nirmala UI" w:cs="Nirmala UI"/>
+        </w:rPr>
+        <w:t>हैं</w:t>
+      </w:r>
+      <w:proofErr w:type="spellEnd"/>
+      <w:r>
+        <w:rPr>
+          <w:rFonts w:ascii="Nirmala UI" w:hAnsi="Nirmala UI" w:cs="Nirmala UI"/>
+        </w:rPr>
+        <w:t>।</w:t>
+      </w:r>
+    </w:p>
+    <w:p/>
+    <w:p>
+      <w:proofErr w:type="spellStart"/>
+      <w:r>
+        <w:rPr>
+          <w:rFonts w:ascii="Nirmala UI" w:hAnsi="Nirmala UI" w:cs="Nirmala UI"/>
+        </w:rPr>
+        <w:t>मिशन</w:t>
+      </w:r>
+      <w:proofErr w:type="spellEnd"/>
+      <w:r>
+        <w:t xml:space="preserve"> (Mission)</w:t>
+      </w:r>
+    </w:p>
+    <w:p/>
+    <w:p>
+      <w:proofErr w:type="spellStart"/>
+      <w:r>
+        <w:rPr>
+          <w:rFonts w:ascii="Nirmala UI" w:hAnsi="Nirmala UI" w:cs="Nirmala UI"/>
+        </w:rPr>
+        <w:t>सस्ता</w:t>
+      </w:r>
+      <w:proofErr w:type="spellEnd"/>
+      <w:r>
+        <w:t xml:space="preserve"> </w:t>
+      </w:r>
+      <w:proofErr w:type="spellStart"/>
+      <w:r>
+        <w:rPr>
+          <w:rFonts w:ascii="Nirmala UI" w:hAnsi="Nirmala UI" w:cs="Nirmala UI"/>
+        </w:rPr>
+        <w:t>और</w:t>
+      </w:r>
+      <w:proofErr w:type="spellEnd"/>
+      <w:r>
+        <w:t xml:space="preserve"> </w:t>
+      </w:r>
+      <w:proofErr w:type="spellStart"/>
+      <w:r>
+        <w:rPr>
+          <w:rFonts w:ascii="Nirmala UI" w:hAnsi="Nirmala UI" w:cs="Nirmala UI"/>
+        </w:rPr>
+        <w:t>अच्छा</w:t>
+      </w:r>
+      <w:proofErr w:type="spellEnd"/>
+      <w:r>
+        <w:t xml:space="preserve"> </w:t>
+      </w:r>
+      <w:proofErr w:type="spellStart"/>
+      <w:r>
+        <w:rPr>
+          <w:rFonts w:ascii="Nirmala UI" w:hAnsi="Nirmala UI" w:cs="Nirmala UI"/>
+        </w:rPr>
+        <w:t>इलाज</w:t>
+      </w:r>
+      <w:proofErr w:type="spellEnd"/>
+    </w:p>
+    <w:p>
+      <w:proofErr w:type="spellStart"/>
+      <w:r>
+        <w:rPr>
+          <w:rFonts w:ascii="Nirmala UI" w:hAnsi="Nirmala UI" w:cs="Nirmala UI"/>
+        </w:rPr>
+        <w:t>छोटे</w:t>
+      </w:r>
+      <w:proofErr w:type="spellEnd"/>
+      <w:r>
+        <w:t xml:space="preserve"> </w:t>
+      </w:r>
+      <w:proofErr w:type="spellStart"/>
+      <w:r>
+        <w:rPr>
+          <w:rFonts w:ascii="Nirmala UI" w:hAnsi="Nirmala UI" w:cs="Nirmala UI"/>
+        </w:rPr>
+        <w:t>शहरों</w:t>
+      </w:r>
+      <w:proofErr w:type="spellEnd"/>
+      <w:r>
+        <w:t xml:space="preserve"> </w:t>
+      </w:r>
+      <w:proofErr w:type="spellStart"/>
+      <w:r>
+        <w:rPr>
+          <w:rFonts w:ascii="Nirmala UI" w:hAnsi="Nirmala UI" w:cs="Nirmala UI"/>
+        </w:rPr>
+        <w:t>और</w:t>
+      </w:r>
+      <w:proofErr w:type="spellEnd"/>
+      <w:r>
+        <w:t xml:space="preserve"> </w:t>
+      </w:r>
+      <w:proofErr w:type="spellStart"/>
+      <w:r>
+        <w:rPr>
+          <w:rFonts w:ascii="Nirmala UI" w:hAnsi="Nirmala UI" w:cs="Nirmala UI"/>
+        </w:rPr>
+        <w:t>गांवों</w:t>
+      </w:r>
+      <w:proofErr w:type="spellEnd"/>
+      <w:r>
+        <w:t xml:space="preserve"> </w:t>
+      </w:r>
+      <w:proofErr w:type="spellStart"/>
+      <w:r>
+        <w:rPr>
+          <w:rFonts w:ascii="Nirmala UI" w:hAnsi="Nirmala UI" w:cs="Nirmala UI"/>
+        </w:rPr>
+        <w:t>के</w:t>
+      </w:r>
+      <w:proofErr w:type="spellEnd"/>
+      <w:r>
+        <w:t xml:space="preserve"> </w:t>
+      </w:r>
+      <w:proofErr w:type="spellStart"/>
+      <w:r>
+        <w:rPr>
+          <w:rFonts w:ascii="Nirmala UI" w:hAnsi="Nirmala UI" w:cs="Nirmala UI"/>
+        </w:rPr>
+        <w:t>लोगों</w:t>
+      </w:r>
+      <w:proofErr w:type="spellEnd"/>
+      <w:r>
+        <w:t xml:space="preserve"> </w:t>
+      </w:r>
+      <w:proofErr w:type="spellStart"/>
+      <w:r>
+        <w:rPr>
+          <w:rFonts w:ascii="Nirmala UI" w:hAnsi="Nirmala UI" w:cs="Nirmala UI"/>
+        </w:rPr>
+        <w:t>को</w:t>
+      </w:r>
+      <w:proofErr w:type="spellEnd"/>
+      <w:r>
+        <w:t xml:space="preserve"> </w:t>
+      </w:r>
+      <w:proofErr w:type="spellStart"/>
+      <w:r>
+        <w:rPr>
+          <w:rFonts w:ascii="Nirmala UI" w:hAnsi="Nirmala UI" w:cs="Nirmala UI"/>
+        </w:rPr>
+        <w:t>आधुनिक</w:t>
+      </w:r>
+      <w:proofErr w:type="spellEnd"/>
+      <w:r>
+        <w:t xml:space="preserve"> </w:t>
+      </w:r>
+      <w:proofErr w:type="spellStart"/>
+      <w:r>
+        <w:rPr>
+          <w:rFonts w:ascii="Nirmala UI" w:hAnsi="Nirmala UI" w:cs="Nirmala UI"/>
+        </w:rPr>
+        <w:t>मशीनों</w:t>
+      </w:r>
+      <w:proofErr w:type="spellEnd"/>
+      <w:r>
+        <w:t xml:space="preserve">, </w:t>
+      </w:r>
+      <w:proofErr w:type="spellStart"/>
+      <w:r>
+        <w:rPr>
+          <w:rFonts w:ascii="Nirmala UI" w:hAnsi="Nirmala UI" w:cs="Nirmala UI"/>
+        </w:rPr>
+        <w:t>अच्छी</w:t>
+      </w:r>
+      <w:proofErr w:type="spellEnd"/>
+      <w:r>
+        <w:t xml:space="preserve"> </w:t>
+      </w:r>
+      <w:proofErr w:type="spellStart"/>
+      <w:r>
+        <w:rPr>
+          <w:rFonts w:ascii="Nirmala UI" w:hAnsi="Nirmala UI" w:cs="Nirmala UI"/>
+        </w:rPr>
+        <w:t>बिल्डिंग</w:t>
+      </w:r>
+      <w:proofErr w:type="spellEnd"/>
+      <w:r>
+        <w:t xml:space="preserve"> </w:t>
+      </w:r>
+      <w:proofErr w:type="spellStart"/>
+      <w:r>
+        <w:rPr>
+          <w:rFonts w:ascii="Nirmala UI" w:hAnsi="Nirmala UI" w:cs="Nirmala UI"/>
+        </w:rPr>
+        <w:t>और</w:t>
+      </w:r>
+      <w:proofErr w:type="spellEnd"/>
+      <w:r>
+        <w:t xml:space="preserve"> </w:t>
+      </w:r>
+      <w:proofErr w:type="spellStart"/>
+      <w:r>
+        <w:rPr>
+          <w:rFonts w:ascii="Nirmala UI" w:hAnsi="Nirmala UI" w:cs="Nirmala UI"/>
+        </w:rPr>
+        <w:t>बेहतर</w:t>
+      </w:r>
+      <w:proofErr w:type="spellEnd"/>
+      <w:r>
+        <w:t xml:space="preserve"> </w:t>
+      </w:r>
+      <w:proofErr w:type="spellStart"/>
+      <w:r>
+        <w:rPr>
+          <w:rFonts w:ascii="Nirmala UI" w:hAnsi="Nirmala UI" w:cs="Nirmala UI"/>
+        </w:rPr>
+        <w:t>सुविधाओं</w:t>
+      </w:r>
+      <w:proofErr w:type="spellEnd"/>
+      <w:r>
+        <w:t xml:space="preserve"> </w:t>
+      </w:r>
+      <w:proofErr w:type="spellStart"/>
+      <w:r>
+        <w:rPr>
+          <w:rFonts w:ascii="Nirmala UI" w:hAnsi="Nirmala UI" w:cs="Nirmala UI"/>
+        </w:rPr>
+        <w:t>के</w:t>
+      </w:r>
+      <w:proofErr w:type="spellEnd"/>
+      <w:r>
+        <w:t xml:space="preserve"> </w:t>
+      </w:r>
+      <w:proofErr w:type="spellStart"/>
+      <w:r>
+        <w:rPr>
+          <w:rFonts w:ascii="Nirmala UI" w:hAnsi="Nirmala UI" w:cs="Nirmala UI"/>
+        </w:rPr>
+        <w:t>साथ</w:t>
+      </w:r>
+      <w:proofErr w:type="spellEnd"/>
+      <w:r>
+        <w:t xml:space="preserve"> </w:t>
+      </w:r>
+      <w:proofErr w:type="spellStart"/>
+      <w:r>
+        <w:rPr>
+          <w:rFonts w:ascii="Nirmala UI" w:hAnsi="Nirmala UI" w:cs="Nirmala UI"/>
+        </w:rPr>
+        <w:t>उच्च</w:t>
+      </w:r>
+      <w:proofErr w:type="spellEnd"/>
+      <w:r>
+        <w:t xml:space="preserve"> </w:t>
+      </w:r>
+      <w:proofErr w:type="spellStart"/>
+      <w:r>
+        <w:rPr>
+          <w:rFonts w:ascii="Nirmala UI" w:hAnsi="Nirmala UI" w:cs="Nirmala UI"/>
+        </w:rPr>
+        <w:t>गुणवत्ता</w:t>
+      </w:r>
+      <w:proofErr w:type="spellEnd"/>
+      <w:r>
+        <w:t xml:space="preserve"> </w:t>
+      </w:r>
+      <w:proofErr w:type="spellStart"/>
+      <w:r>
+        <w:rPr>
+          <w:rFonts w:ascii="Nirmala UI" w:hAnsi="Nirmala UI" w:cs="Nirmala UI"/>
+        </w:rPr>
+        <w:t>वाला</w:t>
+      </w:r>
+      <w:proofErr w:type="spellEnd"/>
+      <w:r>
+        <w:t xml:space="preserve"> </w:t>
+      </w:r>
+      <w:proofErr w:type="spellStart"/>
+      <w:r>
+        <w:rPr>
+          <w:rFonts w:ascii="Nirmala UI" w:hAnsi="Nirmala UI" w:cs="Nirmala UI"/>
+        </w:rPr>
+        <w:t>इलाज</w:t>
+      </w:r>
+      <w:proofErr w:type="spellEnd"/>
+      <w:r>
+        <w:t xml:space="preserve"> </w:t>
+      </w:r>
+      <w:proofErr w:type="spellStart"/>
+      <w:r>
+        <w:rPr>
+          <w:rFonts w:ascii="Nirmala UI" w:hAnsi="Nirmala UI" w:cs="Nirmala UI"/>
+        </w:rPr>
+        <w:t>उचित</w:t>
+      </w:r>
+      <w:proofErr w:type="spellEnd"/>
+      <w:r>
+        <w:t xml:space="preserve"> </w:t>
+      </w:r>
+      <w:proofErr w:type="spellStart"/>
+      <w:r>
+        <w:rPr>
+          <w:rFonts w:ascii="Nirmala UI" w:hAnsi="Nirmala UI" w:cs="Nirmala UI"/>
+        </w:rPr>
+        <w:t>कीमत</w:t>
+      </w:r>
+      <w:proofErr w:type="spellEnd"/>
+      <w:r>
+        <w:t xml:space="preserve"> </w:t>
+      </w:r>
+      <w:proofErr w:type="spellStart"/>
+      <w:r>
+        <w:rPr>
+          <w:rFonts w:ascii="Nirmala UI" w:hAnsi="Nirmala UI" w:cs="Nirmala UI"/>
+        </w:rPr>
+        <w:t>पर</w:t>
+      </w:r>
+      <w:proofErr w:type="spellEnd"/>
+      <w:r>
+        <w:t xml:space="preserve"> </w:t>
+      </w:r>
+      <w:proofErr w:type="spellStart"/>
+      <w:r>
+        <w:rPr>
+          <w:rFonts w:ascii="Nirmala UI" w:hAnsi="Nirmala UI" w:cs="Nirmala UI"/>
+        </w:rPr>
+        <w:t>उपलब्ध</w:t>
+      </w:r>
+      <w:proofErr w:type="spellEnd"/>
+      <w:r>
+        <w:t xml:space="preserve"> </w:t>
+      </w:r>
+      <w:proofErr w:type="spellStart"/>
+      <w:r>
+        <w:rPr>
+          <w:rFonts w:ascii="Nirmala UI" w:hAnsi="Nirmala UI" w:cs="Nirmala UI"/>
+        </w:rPr>
+        <w:t>कराना</w:t>
+      </w:r>
+      <w:proofErr w:type="spellEnd"/>
+      <w:r>
+        <w:rPr>
+          <w:rFonts w:ascii="Nirmala UI" w:hAnsi="Nirmala UI" w:cs="Nirmala UI"/>
+        </w:rPr>
+        <w:t>।</w:t>
+      </w:r>
+    </w:p>
+    <w:p/>
+    <w:p>
+      <w:proofErr w:type="spellStart"/>
+      <w:r>
+        <w:rPr>
+          <w:rFonts w:ascii="Nirmala UI" w:hAnsi="Nirmala UI" w:cs="Nirmala UI"/>
+        </w:rPr>
+        <w:t>मरीज</w:t>
+      </w:r>
+      <w:proofErr w:type="spellEnd"/>
+      <w:r>
+        <w:t xml:space="preserve"> </w:t>
+      </w:r>
+      <w:proofErr w:type="spellStart"/>
+      <w:r>
+        <w:rPr>
+          <w:rFonts w:ascii="Nirmala UI" w:hAnsi="Nirmala UI" w:cs="Nirmala UI"/>
+        </w:rPr>
+        <w:t>सबसे</w:t>
+      </w:r>
+      <w:proofErr w:type="spellEnd"/>
+      <w:r>
+        <w:t xml:space="preserve"> </w:t>
+      </w:r>
+      <w:proofErr w:type="spellStart"/>
+      <w:r>
+        <w:rPr>
+          <w:rFonts w:ascii="Nirmala UI" w:hAnsi="Nirmala UI" w:cs="Nirmala UI"/>
+        </w:rPr>
+        <w:t>पहले</w:t>
+      </w:r>
+      <w:proofErr w:type="spellEnd"/>
+    </w:p>
+    <w:p>
+      <w:proofErr w:type="spellStart"/>
+      <w:r>
+        <w:rPr>
+          <w:rFonts w:ascii="Nirmala UI" w:hAnsi="Nirmala UI" w:cs="Nirmala UI"/>
+        </w:rPr>
+        <w:lastRenderedPageBreak/>
+        <w:t>हर</w:t>
+      </w:r>
+      <w:proofErr w:type="spellEnd"/>
+      <w:r>
+        <w:t xml:space="preserve"> </w:t>
+      </w:r>
+      <w:proofErr w:type="spellStart"/>
+      <w:r>
+        <w:rPr>
+          <w:rFonts w:ascii="Nirmala UI" w:hAnsi="Nirmala UI" w:cs="Nirmala UI"/>
+        </w:rPr>
+        <w:t>मरीज</w:t>
+      </w:r>
+      <w:proofErr w:type="spellEnd"/>
+      <w:r>
+        <w:t xml:space="preserve"> </w:t>
+      </w:r>
+      <w:proofErr w:type="spellStart"/>
+      <w:r>
+        <w:rPr>
+          <w:rFonts w:ascii="Nirmala UI" w:hAnsi="Nirmala UI" w:cs="Nirmala UI"/>
+        </w:rPr>
+        <w:t>का</w:t>
+      </w:r>
+      <w:proofErr w:type="spellEnd"/>
+      <w:r>
+        <w:t xml:space="preserve"> </w:t>
+      </w:r>
+      <w:proofErr w:type="spellStart"/>
+      <w:r>
+        <w:rPr>
+          <w:rFonts w:ascii="Nirmala UI" w:hAnsi="Nirmala UI" w:cs="Nirmala UI"/>
+        </w:rPr>
+        <w:t>इलाज</w:t>
+      </w:r>
+      <w:proofErr w:type="spellEnd"/>
+      <w:r>
+        <w:t xml:space="preserve"> </w:t>
+      </w:r>
+      <w:proofErr w:type="spellStart"/>
+      <w:r>
+        <w:rPr>
+          <w:rFonts w:ascii="Nirmala UI" w:hAnsi="Nirmala UI" w:cs="Nirmala UI"/>
+        </w:rPr>
+        <w:t>इंसानियत</w:t>
+      </w:r>
+      <w:proofErr w:type="spellEnd"/>
+      <w:r>
+        <w:t xml:space="preserve">, </w:t>
+      </w:r>
+      <w:proofErr w:type="spellStart"/>
+      <w:r>
+        <w:rPr>
+          <w:rFonts w:ascii="Nirmala UI" w:hAnsi="Nirmala UI" w:cs="Nirmala UI"/>
+        </w:rPr>
+        <w:t>ईमानदारी</w:t>
+      </w:r>
+      <w:proofErr w:type="spellEnd"/>
+      <w:r>
+        <w:t xml:space="preserve"> </w:t>
+      </w:r>
+      <w:proofErr w:type="spellStart"/>
+      <w:r>
+        <w:rPr>
+          <w:rFonts w:ascii="Nirmala UI" w:hAnsi="Nirmala UI" w:cs="Nirmala UI"/>
+        </w:rPr>
+        <w:t>और</w:t>
+      </w:r>
+      <w:proofErr w:type="spellEnd"/>
+      <w:r>
+        <w:t xml:space="preserve"> </w:t>
+      </w:r>
+      <w:proofErr w:type="spellStart"/>
+      <w:r>
+        <w:rPr>
+          <w:rFonts w:ascii="Nirmala UI" w:hAnsi="Nirmala UI" w:cs="Nirmala UI"/>
+        </w:rPr>
+        <w:t>सम्मान</w:t>
+      </w:r>
+      <w:proofErr w:type="spellEnd"/>
+      <w:r>
+        <w:t xml:space="preserve"> </w:t>
+      </w:r>
+      <w:proofErr w:type="spellStart"/>
+      <w:r>
+        <w:rPr>
+          <w:rFonts w:ascii="Nirmala UI" w:hAnsi="Nirmala UI" w:cs="Nirmala UI"/>
+        </w:rPr>
+        <w:t>के</w:t>
+      </w:r>
+      <w:proofErr w:type="spellEnd"/>
+      <w:r>
+        <w:t xml:space="preserve"> </w:t>
+      </w:r>
+      <w:proofErr w:type="spellStart"/>
+      <w:r>
+        <w:rPr>
+          <w:rFonts w:ascii="Nirmala UI" w:hAnsi="Nirmala UI" w:cs="Nirmala UI"/>
+        </w:rPr>
+        <w:t>साथ</w:t>
+      </w:r>
+      <w:proofErr w:type="spellEnd"/>
+      <w:r>
+        <w:t xml:space="preserve"> </w:t>
+      </w:r>
+      <w:proofErr w:type="spellStart"/>
+      <w:r>
+        <w:rPr>
+          <w:rFonts w:ascii="Nirmala UI" w:hAnsi="Nirmala UI" w:cs="Nirmala UI"/>
+        </w:rPr>
+        <w:t>करना</w:t>
+      </w:r>
+      <w:proofErr w:type="spellEnd"/>
+      <w:r>
+        <w:t xml:space="preserve">, </w:t>
+      </w:r>
+      <w:proofErr w:type="spellStart"/>
+      <w:r>
+        <w:rPr>
+          <w:rFonts w:ascii="Nirmala UI" w:hAnsi="Nirmala UI" w:cs="Nirmala UI"/>
+        </w:rPr>
+        <w:t>ताकि</w:t>
+      </w:r>
+      <w:proofErr w:type="spellEnd"/>
+      <w:r>
+        <w:t xml:space="preserve"> </w:t>
+      </w:r>
+      <w:proofErr w:type="spellStart"/>
+      <w:r>
+        <w:rPr>
+          <w:rFonts w:ascii="Nirmala UI" w:hAnsi="Nirmala UI" w:cs="Nirmala UI"/>
+        </w:rPr>
+        <w:t>उन्हें</w:t>
+      </w:r>
+      <w:proofErr w:type="spellEnd"/>
+      <w:r>
+        <w:t xml:space="preserve"> </w:t>
+      </w:r>
+      <w:proofErr w:type="spellStart"/>
+      <w:r>
+        <w:rPr>
+          <w:rFonts w:ascii="Nirmala UI" w:hAnsi="Nirmala UI" w:cs="Nirmala UI"/>
+        </w:rPr>
+        <w:t>भरोसा</w:t>
+      </w:r>
+      <w:proofErr w:type="spellEnd"/>
+      <w:r>
+        <w:t xml:space="preserve"> </w:t>
+      </w:r>
+      <w:proofErr w:type="spellStart"/>
+      <w:r>
+        <w:rPr>
+          <w:rFonts w:ascii="Nirmala UI" w:hAnsi="Nirmala UI" w:cs="Nirmala UI"/>
+        </w:rPr>
+        <w:t>और</w:t>
+      </w:r>
+      <w:proofErr w:type="spellEnd"/>
+      <w:r>
+        <w:t xml:space="preserve"> </w:t>
+      </w:r>
+      <w:proofErr w:type="spellStart"/>
+      <w:r>
+        <w:rPr>
+          <w:rFonts w:ascii="Nirmala UI" w:hAnsi="Nirmala UI" w:cs="Nirmala UI"/>
+        </w:rPr>
+        <w:t>सुकून</w:t>
+      </w:r>
+      <w:proofErr w:type="spellEnd"/>
+      <w:r>
+        <w:t xml:space="preserve"> </w:t>
+      </w:r>
+      <w:proofErr w:type="spellStart"/>
+      <w:r>
+        <w:rPr>
+          <w:rFonts w:ascii="Nirmala UI" w:hAnsi="Nirmala UI" w:cs="Nirmala UI"/>
+        </w:rPr>
+        <w:t>महसूस</w:t>
+      </w:r>
+      <w:proofErr w:type="spellEnd"/>
+      <w:r>
+        <w:t xml:space="preserve"> </w:t>
+      </w:r>
+      <w:proofErr w:type="spellStart"/>
+      <w:r>
+        <w:rPr>
+          <w:rFonts w:ascii="Nirmala UI" w:hAnsi="Nirmala UI" w:cs="Nirmala UI"/>
+        </w:rPr>
+        <w:t>हो</w:t>
+      </w:r>
+      <w:proofErr w:type="spellEnd"/>
+      <w:r>
+        <w:rPr>
+          <w:rFonts w:ascii="Nirmala UI" w:hAnsi="Nirmala UI" w:cs="Nirmala UI"/>
+        </w:rPr>
+        <w:t>।</w:t>
+      </w:r>
+    </w:p>
+    <w:p/>
+    <w:p>
+      <w:proofErr w:type="spellStart"/>
+      <w:r>
+        <w:rPr>
+          <w:rFonts w:ascii="Nirmala UI" w:hAnsi="Nirmala UI" w:cs="Nirmala UI"/>
+        </w:rPr>
+        <w:t>गांवों</w:t>
+      </w:r>
+      <w:proofErr w:type="spellEnd"/>
+      <w:r>
+        <w:t xml:space="preserve"> </w:t>
+      </w:r>
+      <w:proofErr w:type="spellStart"/>
+      <w:r>
+        <w:rPr>
+          <w:rFonts w:ascii="Nirmala UI" w:hAnsi="Nirmala UI" w:cs="Nirmala UI"/>
+        </w:rPr>
+        <w:t>के</w:t>
+      </w:r>
+      <w:proofErr w:type="spellEnd"/>
+      <w:r>
+        <w:t xml:space="preserve"> </w:t>
+      </w:r>
+      <w:proofErr w:type="spellStart"/>
+      <w:r>
+        <w:rPr>
+          <w:rFonts w:ascii="Nirmala UI" w:hAnsi="Nirmala UI" w:cs="Nirmala UI"/>
+        </w:rPr>
+        <w:t>लिए</w:t>
+      </w:r>
+      <w:proofErr w:type="spellEnd"/>
+      <w:r>
+        <w:t xml:space="preserve"> </w:t>
+      </w:r>
+      <w:proofErr w:type="spellStart"/>
+      <w:r>
+        <w:rPr>
+          <w:rFonts w:ascii="Nirmala UI" w:hAnsi="Nirmala UI" w:cs="Nirmala UI"/>
+        </w:rPr>
+        <w:t>बेहतर</w:t>
+      </w:r>
+      <w:proofErr w:type="spellEnd"/>
+      <w:r>
+        <w:t xml:space="preserve"> </w:t>
+      </w:r>
+      <w:proofErr w:type="spellStart"/>
+      <w:r>
+        <w:rPr>
+          <w:rFonts w:ascii="Nirmala UI" w:hAnsi="Nirmala UI" w:cs="Nirmala UI"/>
+        </w:rPr>
+        <w:t>स्वास्थ्य</w:t>
+      </w:r>
+      <w:proofErr w:type="spellEnd"/>
+      <w:r>
+        <w:t xml:space="preserve"> </w:t>
+      </w:r>
+      <w:proofErr w:type="spellStart"/>
+      <w:r>
+        <w:rPr>
+          <w:rFonts w:ascii="Nirmala UI" w:hAnsi="Nirmala UI" w:cs="Nirmala UI"/>
+        </w:rPr>
+        <w:t>सेवाएँ</w:t>
+      </w:r>
+      <w:proofErr w:type="spellEnd"/>
+    </w:p>
+    <w:p>
+      <w:proofErr w:type="spellStart"/>
+      <w:r>
+        <w:rPr>
+          <w:rFonts w:ascii="Nirmala UI" w:hAnsi="Nirmala UI" w:cs="Nirmala UI"/>
+        </w:rPr>
+        <w:t>आसपास</w:t>
+      </w:r>
+      <w:proofErr w:type="spellEnd"/>
+      <w:r>
+        <w:t xml:space="preserve"> </w:t>
+      </w:r>
+      <w:proofErr w:type="spellStart"/>
+      <w:r>
+        <w:rPr>
+          <w:rFonts w:ascii="Nirmala UI" w:hAnsi="Nirmala UI" w:cs="Nirmala UI"/>
+        </w:rPr>
+        <w:t>के</w:t>
+      </w:r>
+      <w:proofErr w:type="spellEnd"/>
+      <w:r>
+        <w:t xml:space="preserve"> </w:t>
+      </w:r>
+      <w:proofErr w:type="spellStart"/>
+      <w:r>
+        <w:rPr>
+          <w:rFonts w:ascii="Nirmala UI" w:hAnsi="Nirmala UI" w:cs="Nirmala UI"/>
+        </w:rPr>
+        <w:t>गांवों</w:t>
+      </w:r>
+      <w:proofErr w:type="spellEnd"/>
+      <w:r>
+        <w:t xml:space="preserve"> </w:t>
+      </w:r>
+      <w:proofErr w:type="spellStart"/>
+      <w:r>
+        <w:rPr>
+          <w:rFonts w:ascii="Nirmala UI" w:hAnsi="Nirmala UI" w:cs="Nirmala UI"/>
+        </w:rPr>
+        <w:t>के</w:t>
+      </w:r>
+      <w:proofErr w:type="spellEnd"/>
+      <w:r>
+        <w:t xml:space="preserve"> </w:t>
+      </w:r>
+      <w:proofErr w:type="spellStart"/>
+      <w:r>
+        <w:rPr>
+          <w:rFonts w:ascii="Nirmala UI" w:hAnsi="Nirmala UI" w:cs="Nirmala UI"/>
+        </w:rPr>
+        <w:t>लोगों</w:t>
+      </w:r>
+      <w:proofErr w:type="spellEnd"/>
+      <w:r>
+        <w:t xml:space="preserve"> </w:t>
+      </w:r>
+      <w:proofErr w:type="spellStart"/>
+      <w:r>
+        <w:rPr>
+          <w:rFonts w:ascii="Nirmala UI" w:hAnsi="Nirmala UI" w:cs="Nirmala UI"/>
+        </w:rPr>
+        <w:t>को</w:t>
+      </w:r>
+      <w:proofErr w:type="spellEnd"/>
+      <w:r>
+        <w:t xml:space="preserve"> </w:t>
+      </w:r>
+      <w:proofErr w:type="spellStart"/>
+      <w:r>
+        <w:rPr>
+          <w:rFonts w:ascii="Nirmala UI" w:hAnsi="Nirmala UI" w:cs="Nirmala UI"/>
+        </w:rPr>
+        <w:t>समय</w:t>
+      </w:r>
+      <w:proofErr w:type="spellEnd"/>
+      <w:r>
+        <w:t xml:space="preserve"> </w:t>
+      </w:r>
+      <w:proofErr w:type="spellStart"/>
+      <w:r>
+        <w:rPr>
+          <w:rFonts w:ascii="Nirmala UI" w:hAnsi="Nirmala UI" w:cs="Nirmala UI"/>
+        </w:rPr>
+        <w:t>पर</w:t>
+      </w:r>
+      <w:proofErr w:type="spellEnd"/>
+      <w:r>
+        <w:t xml:space="preserve"> </w:t>
+      </w:r>
+      <w:proofErr w:type="spellStart"/>
+      <w:r>
+        <w:rPr>
+          <w:rFonts w:ascii="Nirmala UI" w:hAnsi="Nirmala UI" w:cs="Nirmala UI"/>
+        </w:rPr>
+        <w:t>जांच</w:t>
+      </w:r>
+      <w:proofErr w:type="spellEnd"/>
+      <w:r>
+        <w:t xml:space="preserve">, </w:t>
+      </w:r>
+      <w:proofErr w:type="spellStart"/>
+      <w:r>
+        <w:rPr>
+          <w:rFonts w:ascii="Nirmala UI" w:hAnsi="Nirmala UI" w:cs="Nirmala UI"/>
+        </w:rPr>
+        <w:t>इलाज</w:t>
+      </w:r>
+      <w:proofErr w:type="spellEnd"/>
+      <w:r>
+        <w:t xml:space="preserve"> </w:t>
+      </w:r>
+      <w:proofErr w:type="spellStart"/>
+      <w:r>
+        <w:rPr>
+          <w:rFonts w:ascii="Nirmala UI" w:hAnsi="Nirmala UI" w:cs="Nirmala UI"/>
+        </w:rPr>
+        <w:t>और</w:t>
+      </w:r>
+      <w:proofErr w:type="spellEnd"/>
+      <w:r>
+        <w:t xml:space="preserve"> </w:t>
+      </w:r>
+      <w:proofErr w:type="spellStart"/>
+      <w:r>
+        <w:rPr>
+          <w:rFonts w:ascii="Nirmala UI" w:hAnsi="Nirmala UI" w:cs="Nirmala UI"/>
+        </w:rPr>
+        <w:t>विशेषज</w:t>
+      </w:r>
+      <w:proofErr w:type="spellEnd"/>
+      <w:r>
+        <w:rPr>
+          <w:rFonts w:ascii="Sans Serif Collection" w:hAnsi="Sans Serif Collection" w:cs="Sans Serif Collection"/>
+        </w:rPr>
+        <w:t>�</w:t>
+      </w:r>
+      <w:r>
+        <w:rPr>
+          <w:rFonts w:ascii="Sans Serif Collection" w:hAnsi="Sans Serif Collection" w:cs="Sans Serif Collection"/>
+        </w:rPr>
+        <w:br/>
+      </w:r>
+      <w:r>
+        <w:rPr>
+          <w:rFonts w:ascii="Sans Serif Collection" w:hAnsi="Sans Serif Collection" w:cs="Sans Serif Collection"/>
+        </w:rPr>
+        <w:br/>
+      </w:r>
+      <w:r>
+        <w:rPr>
+          <w:rFonts w:ascii="Sans Serif Collection" w:hAnsi="Sans Serif Collection" w:cs="Sans Serif Collection"/>
+        </w:rPr>
+        <w:br/>
+      </w:r>
+      <w:r>
+        <w:t>Chairman’s Message</w:t>
+      </w:r>
+    </w:p>
+    <w:p/>
+    <w:p/>
+    <w:p/>
+    <w:p>
+      <w:r>
+        <w:t>For many families in smaller towns and nearby villages, access to advanced healthcare has often meant traveling long distances to big cities. This reality inspired Shan Group to take a meaningful step toward bringing modern, reliable, and compassionate healthcare closer to the communities that need it most.</w:t>
+      </w:r>
+    </w:p>
+    <w:p/>
+    <w:p>
+      <w:r>
+        <w:t>Our hospital has been established with a clear purpose — to provide high-quality medical services, advanced technology, and skilled healthcare professionals while ensuring that treatment remains accessible and affordable for every family.</w:t>
+      </w:r>
+    </w:p>
+    <w:p/>
+    <w:p>
+      <w:r>
+        <w:t>This initiative reflects our deep sense of social responsibility and commitment to community well-being. As we serve this region with dedication and compassion, our vision is also to expand and establish more healthcare facilities in the future, reaching many more underserved communities.</w:t>
+      </w:r>
+    </w:p>
+    <w:p/>
+    <w:p>
+      <w:r>
+        <w:t>We sincerely thank the community for their trust and support as we continue our journey toward building a healthier and stronger society.</w:t>
+      </w:r>
+    </w:p>
+    <w:p/>
+    <w:p>
+      <w:r>
+        <w:t>Warm regards,</w:t>
+      </w:r>
+    </w:p>
+    <w:p>
+      <w:r>
+        <w:t xml:space="preserve">Dr Shan Chowdhury </w:t>
+      </w:r>
+    </w:p>
+    <w:p>
+      <w:r>
+        <w:t>Chairman &amp; CMD</w:t>
+      </w:r>
+    </w:p>
+    <w:p>
+      <w:r>
+        <w:t>Shan Group</w:t>
+      </w:r>
+    </w:p>
+    <w:p/>
+    <w:p>
+      <w:proofErr w:type="spellStart"/>
+      <w:r>
+        <w:rPr>
+          <w:rFonts w:ascii="Nirmala UI" w:hAnsi="Nirmala UI" w:cs="Nirmala UI"/>
+        </w:rPr>
+        <w:lastRenderedPageBreak/>
+        <w:t>कई</w:t>
+      </w:r>
+      <w:proofErr w:type="spellEnd"/>
+      <w:r>
+        <w:t xml:space="preserve"> </w:t>
+      </w:r>
+      <w:proofErr w:type="spellStart"/>
+      <w:r>
+        <w:rPr>
+          <w:rFonts w:ascii="Nirmala UI" w:hAnsi="Nirmala UI" w:cs="Nirmala UI"/>
+        </w:rPr>
+        <w:t>छोटे</w:t>
+      </w:r>
+      <w:proofErr w:type="spellEnd"/>
+      <w:r>
+        <w:t xml:space="preserve"> </w:t>
+      </w:r>
+      <w:proofErr w:type="spellStart"/>
+      <w:r>
+        <w:rPr>
+          <w:rFonts w:ascii="Nirmala UI" w:hAnsi="Nirmala UI" w:cs="Nirmala UI"/>
+        </w:rPr>
+        <w:t>शहरों</w:t>
+      </w:r>
+      <w:proofErr w:type="spellEnd"/>
+      <w:r>
+        <w:t xml:space="preserve"> </w:t>
+      </w:r>
+      <w:proofErr w:type="spellStart"/>
+      <w:r>
+        <w:rPr>
+          <w:rFonts w:ascii="Nirmala UI" w:hAnsi="Nirmala UI" w:cs="Nirmala UI"/>
+        </w:rPr>
+        <w:t>और</w:t>
+      </w:r>
+      <w:proofErr w:type="spellEnd"/>
+      <w:r>
+        <w:t xml:space="preserve"> </w:t>
+      </w:r>
+      <w:proofErr w:type="spellStart"/>
+      <w:r>
+        <w:rPr>
+          <w:rFonts w:ascii="Nirmala UI" w:hAnsi="Nirmala UI" w:cs="Nirmala UI"/>
+        </w:rPr>
+        <w:t>आसपास</w:t>
+      </w:r>
+      <w:proofErr w:type="spellEnd"/>
+      <w:r>
+        <w:t xml:space="preserve"> </w:t>
+      </w:r>
+      <w:proofErr w:type="spellStart"/>
+      <w:r>
+        <w:rPr>
+          <w:rFonts w:ascii="Nirmala UI" w:hAnsi="Nirmala UI" w:cs="Nirmala UI"/>
+        </w:rPr>
+        <w:t>के</w:t>
+      </w:r>
+      <w:proofErr w:type="spellEnd"/>
+      <w:r>
+        <w:t xml:space="preserve"> </w:t>
+      </w:r>
+      <w:proofErr w:type="spellStart"/>
+      <w:r>
+        <w:rPr>
+          <w:rFonts w:ascii="Nirmala UI" w:hAnsi="Nirmala UI" w:cs="Nirmala UI"/>
+        </w:rPr>
+        <w:t>गांवों</w:t>
+      </w:r>
+      <w:proofErr w:type="spellEnd"/>
+      <w:r>
+        <w:t xml:space="preserve"> </w:t>
+      </w:r>
+      <w:proofErr w:type="spellStart"/>
+      <w:r>
+        <w:rPr>
+          <w:rFonts w:ascii="Nirmala UI" w:hAnsi="Nirmala UI" w:cs="Nirmala UI"/>
+        </w:rPr>
+        <w:t>के</w:t>
+      </w:r>
+      <w:proofErr w:type="spellEnd"/>
+      <w:r>
+        <w:t xml:space="preserve"> </w:t>
+      </w:r>
+      <w:proofErr w:type="spellStart"/>
+      <w:r>
+        <w:rPr>
+          <w:rFonts w:ascii="Nirmala UI" w:hAnsi="Nirmala UI" w:cs="Nirmala UI"/>
+        </w:rPr>
+        <w:t>परिवारों</w:t>
+      </w:r>
+      <w:proofErr w:type="spellEnd"/>
+      <w:r>
+        <w:t xml:space="preserve"> </w:t>
+      </w:r>
+      <w:proofErr w:type="spellStart"/>
+      <w:r>
+        <w:rPr>
+          <w:rFonts w:ascii="Nirmala UI" w:hAnsi="Nirmala UI" w:cs="Nirmala UI"/>
+        </w:rPr>
+        <w:t>के</w:t>
+      </w:r>
+      <w:proofErr w:type="spellEnd"/>
+      <w:r>
+        <w:t xml:space="preserve"> </w:t>
+      </w:r>
+      <w:proofErr w:type="spellStart"/>
+      <w:r>
+        <w:rPr>
+          <w:rFonts w:ascii="Nirmala UI" w:hAnsi="Nirmala UI" w:cs="Nirmala UI"/>
+        </w:rPr>
+        <w:t>लिए</w:t>
+      </w:r>
+      <w:proofErr w:type="spellEnd"/>
+      <w:r>
+        <w:t xml:space="preserve"> </w:t>
+      </w:r>
+      <w:proofErr w:type="spellStart"/>
+      <w:r>
+        <w:rPr>
+          <w:rFonts w:ascii="Nirmala UI" w:hAnsi="Nirmala UI" w:cs="Nirmala UI"/>
+        </w:rPr>
+        <w:t>बेहतर</w:t>
+      </w:r>
+      <w:proofErr w:type="spellEnd"/>
+      <w:r>
+        <w:t xml:space="preserve"> </w:t>
+      </w:r>
+      <w:proofErr w:type="spellStart"/>
+      <w:r>
+        <w:rPr>
+          <w:rFonts w:ascii="Nirmala UI" w:hAnsi="Nirmala UI" w:cs="Nirmala UI"/>
+        </w:rPr>
+        <w:t>इलाज</w:t>
+      </w:r>
+      <w:proofErr w:type="spellEnd"/>
+      <w:r>
+        <w:t xml:space="preserve"> </w:t>
+      </w:r>
+      <w:proofErr w:type="spellStart"/>
+      <w:r>
+        <w:rPr>
+          <w:rFonts w:ascii="Nirmala UI" w:hAnsi="Nirmala UI" w:cs="Nirmala UI"/>
+        </w:rPr>
+        <w:t>पाने</w:t>
+      </w:r>
+      <w:proofErr w:type="spellEnd"/>
+      <w:r>
+        <w:t xml:space="preserve"> </w:t>
+      </w:r>
+      <w:proofErr w:type="spellStart"/>
+      <w:r>
+        <w:rPr>
+          <w:rFonts w:ascii="Nirmala UI" w:hAnsi="Nirmala UI" w:cs="Nirmala UI"/>
+        </w:rPr>
+        <w:t>का</w:t>
+      </w:r>
+      <w:proofErr w:type="spellEnd"/>
+      <w:r>
+        <w:t xml:space="preserve"> </w:t>
+      </w:r>
+      <w:proofErr w:type="spellStart"/>
+      <w:r>
+        <w:rPr>
+          <w:rFonts w:ascii="Nirmala UI" w:hAnsi="Nirmala UI" w:cs="Nirmala UI"/>
+        </w:rPr>
+        <w:t>मतलब</w:t>
+      </w:r>
+      <w:proofErr w:type="spellEnd"/>
+      <w:r>
+        <w:t xml:space="preserve"> </w:t>
+      </w:r>
+      <w:proofErr w:type="spellStart"/>
+      <w:r>
+        <w:rPr>
+          <w:rFonts w:ascii="Nirmala UI" w:hAnsi="Nirmala UI" w:cs="Nirmala UI"/>
+        </w:rPr>
+        <w:t>अक्सर</w:t>
+      </w:r>
+      <w:proofErr w:type="spellEnd"/>
+      <w:r>
+        <w:t xml:space="preserve"> </w:t>
+      </w:r>
+      <w:proofErr w:type="spellStart"/>
+      <w:r>
+        <w:rPr>
+          <w:rFonts w:ascii="Nirmala UI" w:hAnsi="Nirmala UI" w:cs="Nirmala UI"/>
+        </w:rPr>
+        <w:t>बड़े</w:t>
+      </w:r>
+      <w:proofErr w:type="spellEnd"/>
+      <w:r>
+        <w:t xml:space="preserve"> </w:t>
+      </w:r>
+      <w:proofErr w:type="spellStart"/>
+      <w:r>
+        <w:rPr>
+          <w:rFonts w:ascii="Nirmala UI" w:hAnsi="Nirmala UI" w:cs="Nirmala UI"/>
+        </w:rPr>
+        <w:t>शहरों</w:t>
+      </w:r>
+      <w:proofErr w:type="spellEnd"/>
+      <w:r>
+        <w:t xml:space="preserve"> </w:t>
+      </w:r>
+      <w:proofErr w:type="spellStart"/>
+      <w:r>
+        <w:rPr>
+          <w:rFonts w:ascii="Nirmala UI" w:hAnsi="Nirmala UI" w:cs="Nirmala UI"/>
+        </w:rPr>
+        <w:t>तक</w:t>
+      </w:r>
+      <w:proofErr w:type="spellEnd"/>
+      <w:r>
+        <w:t xml:space="preserve"> </w:t>
+      </w:r>
+      <w:proofErr w:type="spellStart"/>
+      <w:r>
+        <w:rPr>
+          <w:rFonts w:ascii="Nirmala UI" w:hAnsi="Nirmala UI" w:cs="Nirmala UI"/>
+        </w:rPr>
+        <w:t>लंबा</w:t>
+      </w:r>
+      <w:proofErr w:type="spellEnd"/>
+      <w:r>
+        <w:t xml:space="preserve"> </w:t>
+      </w:r>
+      <w:proofErr w:type="spellStart"/>
+      <w:r>
+        <w:rPr>
+          <w:rFonts w:ascii="Nirmala UI" w:hAnsi="Nirmala UI" w:cs="Nirmala UI"/>
+        </w:rPr>
+        <w:t>सफर</w:t>
+      </w:r>
+      <w:proofErr w:type="spellEnd"/>
+      <w:r>
+        <w:t xml:space="preserve"> </w:t>
+      </w:r>
+      <w:proofErr w:type="spellStart"/>
+      <w:r>
+        <w:rPr>
+          <w:rFonts w:ascii="Nirmala UI" w:hAnsi="Nirmala UI" w:cs="Nirmala UI"/>
+        </w:rPr>
+        <w:t>तय</w:t>
+      </w:r>
+      <w:proofErr w:type="spellEnd"/>
+      <w:r>
+        <w:t xml:space="preserve"> </w:t>
+      </w:r>
+      <w:proofErr w:type="spellStart"/>
+      <w:r>
+        <w:rPr>
+          <w:rFonts w:ascii="Nirmala UI" w:hAnsi="Nirmala UI" w:cs="Nirmala UI"/>
+        </w:rPr>
+        <w:t>करना</w:t>
+      </w:r>
+      <w:proofErr w:type="spellEnd"/>
+      <w:r>
+        <w:t xml:space="preserve"> </w:t>
+      </w:r>
+      <w:proofErr w:type="spellStart"/>
+      <w:r>
+        <w:rPr>
+          <w:rFonts w:ascii="Nirmala UI" w:hAnsi="Nirmala UI" w:cs="Nirmala UI"/>
+        </w:rPr>
+        <w:t>होता</w:t>
+      </w:r>
+      <w:proofErr w:type="spellEnd"/>
+      <w:r>
+        <w:t xml:space="preserve"> </w:t>
+      </w:r>
+      <w:proofErr w:type="spellStart"/>
+      <w:r>
+        <w:rPr>
+          <w:rFonts w:ascii="Nirmala UI" w:hAnsi="Nirmala UI" w:cs="Nirmala UI"/>
+        </w:rPr>
+        <w:t>था</w:t>
+      </w:r>
+      <w:proofErr w:type="spellEnd"/>
+      <w:r>
+        <w:rPr>
+          <w:rFonts w:ascii="Nirmala UI" w:hAnsi="Nirmala UI" w:cs="Nirmala UI"/>
+        </w:rPr>
+        <w:t>।</w:t>
+      </w:r>
+      <w:r>
+        <w:t xml:space="preserve"> </w:t>
+      </w:r>
+      <w:proofErr w:type="spellStart"/>
+      <w:r>
+        <w:rPr>
+          <w:rFonts w:ascii="Nirmala UI" w:hAnsi="Nirmala UI" w:cs="Nirmala UI"/>
+        </w:rPr>
+        <w:t>इसी</w:t>
+      </w:r>
+      <w:proofErr w:type="spellEnd"/>
+      <w:r>
+        <w:t xml:space="preserve"> </w:t>
+      </w:r>
+      <w:proofErr w:type="spellStart"/>
+      <w:r>
+        <w:rPr>
+          <w:rFonts w:ascii="Nirmala UI" w:hAnsi="Nirmala UI" w:cs="Nirmala UI"/>
+        </w:rPr>
+        <w:t>हकीकत</w:t>
+      </w:r>
+      <w:proofErr w:type="spellEnd"/>
+      <w:r>
+        <w:t xml:space="preserve"> </w:t>
+      </w:r>
+      <w:proofErr w:type="spellStart"/>
+      <w:r>
+        <w:rPr>
+          <w:rFonts w:ascii="Nirmala UI" w:hAnsi="Nirmala UI" w:cs="Nirmala UI"/>
+        </w:rPr>
+        <w:t>को</w:t>
+      </w:r>
+      <w:proofErr w:type="spellEnd"/>
+      <w:r>
+        <w:t xml:space="preserve"> </w:t>
+      </w:r>
+      <w:proofErr w:type="spellStart"/>
+      <w:r>
+        <w:rPr>
+          <w:rFonts w:ascii="Nirmala UI" w:hAnsi="Nirmala UI" w:cs="Nirmala UI"/>
+        </w:rPr>
+        <w:t>देखते</w:t>
+      </w:r>
+      <w:proofErr w:type="spellEnd"/>
+      <w:r>
+        <w:t xml:space="preserve"> </w:t>
+      </w:r>
+      <w:proofErr w:type="spellStart"/>
+      <w:r>
+        <w:rPr>
+          <w:rFonts w:ascii="Nirmala UI" w:hAnsi="Nirmala UI" w:cs="Nirmala UI"/>
+        </w:rPr>
+        <w:t>हुए</w:t>
+      </w:r>
+      <w:proofErr w:type="spellEnd"/>
+      <w:r>
+        <w:t xml:space="preserve"> Shan Group </w:t>
+      </w:r>
+      <w:proofErr w:type="spellStart"/>
+      <w:r>
+        <w:rPr>
+          <w:rFonts w:ascii="Nirmala UI" w:hAnsi="Nirmala UI" w:cs="Nirmala UI"/>
+        </w:rPr>
+        <w:t>ने</w:t>
+      </w:r>
+      <w:proofErr w:type="spellEnd"/>
+      <w:r>
+        <w:t xml:space="preserve"> </w:t>
+      </w:r>
+      <w:proofErr w:type="spellStart"/>
+      <w:r>
+        <w:rPr>
+          <w:rFonts w:ascii="Nirmala UI" w:hAnsi="Nirmala UI" w:cs="Nirmala UI"/>
+        </w:rPr>
+        <w:t>एक</w:t>
+      </w:r>
+      <w:proofErr w:type="spellEnd"/>
+      <w:r>
+        <w:t xml:space="preserve"> </w:t>
+      </w:r>
+      <w:proofErr w:type="spellStart"/>
+      <w:r>
+        <w:rPr>
+          <w:rFonts w:ascii="Nirmala UI" w:hAnsi="Nirmala UI" w:cs="Nirmala UI"/>
+        </w:rPr>
+        <w:t>अहम</w:t>
+      </w:r>
+      <w:proofErr w:type="spellEnd"/>
+      <w:r>
+        <w:t xml:space="preserve"> </w:t>
+      </w:r>
+      <w:proofErr w:type="spellStart"/>
+      <w:r>
+        <w:rPr>
+          <w:rFonts w:ascii="Nirmala UI" w:hAnsi="Nirmala UI" w:cs="Nirmala UI"/>
+        </w:rPr>
+        <w:t>कदम</w:t>
+      </w:r>
+      <w:proofErr w:type="spellEnd"/>
+      <w:r>
+        <w:t xml:space="preserve"> </w:t>
+      </w:r>
+      <w:proofErr w:type="spellStart"/>
+      <w:r>
+        <w:rPr>
+          <w:rFonts w:ascii="Nirmala UI" w:hAnsi="Nirmala UI" w:cs="Nirmala UI"/>
+        </w:rPr>
+        <w:t>उठाने</w:t>
+      </w:r>
+      <w:proofErr w:type="spellEnd"/>
+      <w:r>
+        <w:t xml:space="preserve"> </w:t>
+      </w:r>
+      <w:proofErr w:type="spellStart"/>
+      <w:r>
+        <w:rPr>
+          <w:rFonts w:ascii="Nirmala UI" w:hAnsi="Nirmala UI" w:cs="Nirmala UI"/>
+        </w:rPr>
+        <w:t>का</w:t>
+      </w:r>
+      <w:proofErr w:type="spellEnd"/>
+      <w:r>
+        <w:t xml:space="preserve"> </w:t>
+      </w:r>
+      <w:proofErr w:type="spellStart"/>
+      <w:r>
+        <w:rPr>
+          <w:rFonts w:ascii="Nirmala UI" w:hAnsi="Nirmala UI" w:cs="Nirmala UI"/>
+        </w:rPr>
+        <w:t>फैसला</w:t>
+      </w:r>
+      <w:proofErr w:type="spellEnd"/>
+      <w:r>
+        <w:t xml:space="preserve"> </w:t>
+      </w:r>
+      <w:proofErr w:type="spellStart"/>
+      <w:r>
+        <w:rPr>
+          <w:rFonts w:ascii="Nirmala UI" w:hAnsi="Nirmala UI" w:cs="Nirmala UI"/>
+        </w:rPr>
+        <w:t>किया</w:t>
+      </w:r>
+      <w:proofErr w:type="spellEnd"/>
+      <w:r>
+        <w:t xml:space="preserve">, </w:t>
+      </w:r>
+      <w:proofErr w:type="spellStart"/>
+      <w:r>
+        <w:rPr>
+          <w:rFonts w:ascii="Nirmala UI" w:hAnsi="Nirmala UI" w:cs="Nirmala UI"/>
+        </w:rPr>
+        <w:t>ताकि</w:t>
+      </w:r>
+      <w:proofErr w:type="spellEnd"/>
+      <w:r>
+        <w:t xml:space="preserve"> </w:t>
+      </w:r>
+      <w:proofErr w:type="spellStart"/>
+      <w:r>
+        <w:rPr>
+          <w:rFonts w:ascii="Nirmala UI" w:hAnsi="Nirmala UI" w:cs="Nirmala UI"/>
+        </w:rPr>
+        <w:t>आधुनिक</w:t>
+      </w:r>
+      <w:proofErr w:type="spellEnd"/>
+      <w:r>
+        <w:t xml:space="preserve">, </w:t>
+      </w:r>
+      <w:proofErr w:type="spellStart"/>
+      <w:r>
+        <w:rPr>
+          <w:rFonts w:ascii="Nirmala UI" w:hAnsi="Nirmala UI" w:cs="Nirmala UI"/>
+        </w:rPr>
+        <w:t>भरोसेमंद</w:t>
+      </w:r>
+      <w:proofErr w:type="spellEnd"/>
+      <w:r>
+        <w:t xml:space="preserve"> </w:t>
+      </w:r>
+      <w:proofErr w:type="spellStart"/>
+      <w:r>
+        <w:rPr>
+          <w:rFonts w:ascii="Nirmala UI" w:hAnsi="Nirmala UI" w:cs="Nirmala UI"/>
+        </w:rPr>
+        <w:t>और</w:t>
+      </w:r>
+      <w:proofErr w:type="spellEnd"/>
+      <w:r>
+        <w:t xml:space="preserve"> </w:t>
+      </w:r>
+      <w:proofErr w:type="spellStart"/>
+      <w:r>
+        <w:rPr>
+          <w:rFonts w:ascii="Nirmala UI" w:hAnsi="Nirmala UI" w:cs="Nirmala UI"/>
+        </w:rPr>
+        <w:t>इंसानियत</w:t>
+      </w:r>
+      <w:proofErr w:type="spellEnd"/>
+      <w:r>
+        <w:t xml:space="preserve"> </w:t>
+      </w:r>
+      <w:proofErr w:type="spellStart"/>
+      <w:r>
+        <w:rPr>
+          <w:rFonts w:ascii="Nirmala UI" w:hAnsi="Nirmala UI" w:cs="Nirmala UI"/>
+        </w:rPr>
+        <w:t>से</w:t>
+      </w:r>
+      <w:proofErr w:type="spellEnd"/>
+      <w:r>
+        <w:t xml:space="preserve"> </w:t>
+      </w:r>
+      <w:proofErr w:type="spellStart"/>
+      <w:r>
+        <w:rPr>
+          <w:rFonts w:ascii="Nirmala UI" w:hAnsi="Nirmala UI" w:cs="Nirmala UI"/>
+        </w:rPr>
+        <w:t>भरी</w:t>
+      </w:r>
+      <w:proofErr w:type="spellEnd"/>
+      <w:r>
+        <w:t xml:space="preserve"> </w:t>
+      </w:r>
+      <w:proofErr w:type="spellStart"/>
+      <w:r>
+        <w:rPr>
+          <w:rFonts w:ascii="Nirmala UI" w:hAnsi="Nirmala UI" w:cs="Nirmala UI"/>
+        </w:rPr>
+        <w:t>स्वास्थ्य</w:t>
+      </w:r>
+      <w:proofErr w:type="spellEnd"/>
+      <w:r>
+        <w:t xml:space="preserve"> </w:t>
+      </w:r>
+      <w:proofErr w:type="spellStart"/>
+      <w:r>
+        <w:rPr>
+          <w:rFonts w:ascii="Nirmala UI" w:hAnsi="Nirmala UI" w:cs="Nirmala UI"/>
+        </w:rPr>
+        <w:t>सेवाएँ</w:t>
+      </w:r>
+      <w:proofErr w:type="spellEnd"/>
+      <w:r>
+        <w:t xml:space="preserve"> </w:t>
+      </w:r>
+      <w:proofErr w:type="spellStart"/>
+      <w:r>
+        <w:rPr>
+          <w:rFonts w:ascii="Nirmala UI" w:hAnsi="Nirmala UI" w:cs="Nirmala UI"/>
+        </w:rPr>
+        <w:t>उन</w:t>
+      </w:r>
+      <w:proofErr w:type="spellEnd"/>
+      <w:r>
+        <w:t xml:space="preserve"> </w:t>
+      </w:r>
+      <w:proofErr w:type="spellStart"/>
+      <w:r>
+        <w:rPr>
+          <w:rFonts w:ascii="Nirmala UI" w:hAnsi="Nirmala UI" w:cs="Nirmala UI"/>
+        </w:rPr>
+        <w:t>लोगों</w:t>
+      </w:r>
+      <w:proofErr w:type="spellEnd"/>
+      <w:r>
+        <w:t xml:space="preserve"> </w:t>
+      </w:r>
+      <w:proofErr w:type="spellStart"/>
+      <w:r>
+        <w:rPr>
+          <w:rFonts w:ascii="Nirmala UI" w:hAnsi="Nirmala UI" w:cs="Nirmala UI"/>
+        </w:rPr>
+        <w:t>तक</w:t>
+      </w:r>
+      <w:proofErr w:type="spellEnd"/>
+      <w:r>
+        <w:t xml:space="preserve"> </w:t>
+      </w:r>
+      <w:proofErr w:type="spellStart"/>
+      <w:r>
+        <w:rPr>
+          <w:rFonts w:ascii="Nirmala UI" w:hAnsi="Nirmala UI" w:cs="Nirmala UI"/>
+        </w:rPr>
+        <w:t>पहुंच</w:t>
+      </w:r>
+      <w:proofErr w:type="spellEnd"/>
+      <w:r>
+        <w:t xml:space="preserve"> </w:t>
+      </w:r>
+      <w:proofErr w:type="spellStart"/>
+      <w:r>
+        <w:rPr>
+          <w:rFonts w:ascii="Nirmala UI" w:hAnsi="Nirmala UI" w:cs="Nirmala UI"/>
+        </w:rPr>
+        <w:t>सकें</w:t>
+      </w:r>
+      <w:proofErr w:type="spellEnd"/>
+      <w:r>
+        <w:t xml:space="preserve"> </w:t>
+      </w:r>
+      <w:proofErr w:type="spellStart"/>
+      <w:r>
+        <w:rPr>
+          <w:rFonts w:ascii="Nirmala UI" w:hAnsi="Nirmala UI" w:cs="Nirmala UI"/>
+        </w:rPr>
+        <w:t>जिन्हें</w:t>
+      </w:r>
+      <w:proofErr w:type="spellEnd"/>
+      <w:r>
+        <w:t xml:space="preserve"> </w:t>
+      </w:r>
+      <w:proofErr w:type="spellStart"/>
+      <w:r>
+        <w:rPr>
+          <w:rFonts w:ascii="Nirmala UI" w:hAnsi="Nirmala UI" w:cs="Nirmala UI"/>
+        </w:rPr>
+        <w:t>इसकी</w:t>
+      </w:r>
+      <w:proofErr w:type="spellEnd"/>
+      <w:r>
+        <w:t xml:space="preserve"> </w:t>
+      </w:r>
+      <w:proofErr w:type="spellStart"/>
+      <w:r>
+        <w:rPr>
+          <w:rFonts w:ascii="Nirmala UI" w:hAnsi="Nirmala UI" w:cs="Nirmala UI"/>
+        </w:rPr>
+        <w:t>सबसे</w:t>
+      </w:r>
+      <w:proofErr w:type="spellEnd"/>
+      <w:r>
+        <w:t xml:space="preserve"> </w:t>
+      </w:r>
+      <w:proofErr w:type="spellStart"/>
+      <w:r>
+        <w:rPr>
+          <w:rFonts w:ascii="Nirmala UI" w:hAnsi="Nirmala UI" w:cs="Nirmala UI"/>
+        </w:rPr>
+        <w:t>ज्यादा</w:t>
+      </w:r>
+      <w:proofErr w:type="spellEnd"/>
+      <w:r>
+        <w:t xml:space="preserve"> </w:t>
+      </w:r>
+      <w:proofErr w:type="spellStart"/>
+      <w:r>
+        <w:rPr>
+          <w:rFonts w:ascii="Nirmala UI" w:hAnsi="Nirmala UI" w:cs="Nirmala UI"/>
+        </w:rPr>
+        <w:t>जरूरत</w:t>
+      </w:r>
+      <w:proofErr w:type="spellEnd"/>
+      <w:r>
+        <w:t xml:space="preserve"> </w:t>
+      </w:r>
+      <w:proofErr w:type="spellStart"/>
+      <w:r>
+        <w:rPr>
+          <w:rFonts w:ascii="Nirmala UI" w:hAnsi="Nirmala UI" w:cs="Nirmala UI"/>
+        </w:rPr>
+        <w:t>है</w:t>
+      </w:r>
+      <w:proofErr w:type="spellEnd"/>
+      <w:r>
+        <w:rPr>
+          <w:rFonts w:ascii="Nirmala UI" w:hAnsi="Nirmala UI" w:cs="Nirmala UI"/>
+        </w:rPr>
+        <w:t>।</w:t>
+      </w:r>
+    </w:p>
+    <w:p/>
+    <w:p>
+      <w:proofErr w:type="spellStart"/>
+      <w:r>
+        <w:rPr>
+          <w:rFonts w:ascii="Nirmala UI" w:hAnsi="Nirmala UI" w:cs="Nirmala UI"/>
+        </w:rPr>
+        <w:t>हमारा</w:t>
+      </w:r>
+      <w:proofErr w:type="spellEnd"/>
+      <w:r>
+        <w:t xml:space="preserve"> </w:t>
+      </w:r>
+      <w:proofErr w:type="spellStart"/>
+      <w:r>
+        <w:rPr>
+          <w:rFonts w:ascii="Nirmala UI" w:hAnsi="Nirmala UI" w:cs="Nirmala UI"/>
+        </w:rPr>
+        <w:t>यह</w:t>
+      </w:r>
+      <w:proofErr w:type="spellEnd"/>
+      <w:r>
+        <w:t xml:space="preserve"> </w:t>
+      </w:r>
+      <w:proofErr w:type="spellStart"/>
+      <w:r>
+        <w:rPr>
+          <w:rFonts w:ascii="Nirmala UI" w:hAnsi="Nirmala UI" w:cs="Nirmala UI"/>
+        </w:rPr>
+        <w:t>अस्पताल</w:t>
+      </w:r>
+      <w:proofErr w:type="spellEnd"/>
+      <w:r>
+        <w:t xml:space="preserve"> </w:t>
+      </w:r>
+      <w:proofErr w:type="spellStart"/>
+      <w:r>
+        <w:rPr>
+          <w:rFonts w:ascii="Nirmala UI" w:hAnsi="Nirmala UI" w:cs="Nirmala UI"/>
+        </w:rPr>
+        <w:t>एक</w:t>
+      </w:r>
+      <w:proofErr w:type="spellEnd"/>
+      <w:r>
+        <w:t xml:space="preserve"> </w:t>
+      </w:r>
+      <w:proofErr w:type="spellStart"/>
+      <w:r>
+        <w:rPr>
+          <w:rFonts w:ascii="Nirmala UI" w:hAnsi="Nirmala UI" w:cs="Nirmala UI"/>
+        </w:rPr>
+        <w:t>साफ</w:t>
+      </w:r>
+      <w:proofErr w:type="spellEnd"/>
+      <w:r>
+        <w:t xml:space="preserve"> </w:t>
+      </w:r>
+      <w:proofErr w:type="spellStart"/>
+      <w:r>
+        <w:rPr>
+          <w:rFonts w:ascii="Nirmala UI" w:hAnsi="Nirmala UI" w:cs="Nirmala UI"/>
+        </w:rPr>
+        <w:t>मकसद</w:t>
+      </w:r>
+      <w:proofErr w:type="spellEnd"/>
+      <w:r>
+        <w:t xml:space="preserve"> </w:t>
+      </w:r>
+      <w:proofErr w:type="spellStart"/>
+      <w:r>
+        <w:rPr>
+          <w:rFonts w:ascii="Nirmala UI" w:hAnsi="Nirmala UI" w:cs="Nirmala UI"/>
+        </w:rPr>
+        <w:t>के</w:t>
+      </w:r>
+      <w:proofErr w:type="spellEnd"/>
+      <w:r>
+        <w:t xml:space="preserve"> </w:t>
+      </w:r>
+      <w:proofErr w:type="spellStart"/>
+      <w:r>
+        <w:rPr>
+          <w:rFonts w:ascii="Nirmala UI" w:hAnsi="Nirmala UI" w:cs="Nirmala UI"/>
+        </w:rPr>
+        <w:t>साथ</w:t>
+      </w:r>
+      <w:proofErr w:type="spellEnd"/>
+      <w:r>
+        <w:t xml:space="preserve"> </w:t>
+      </w:r>
+      <w:proofErr w:type="spellStart"/>
+      <w:r>
+        <w:rPr>
+          <w:rFonts w:ascii="Nirmala UI" w:hAnsi="Nirmala UI" w:cs="Nirmala UI"/>
+        </w:rPr>
+        <w:t>बनाया</w:t>
+      </w:r>
+      <w:proofErr w:type="spellEnd"/>
+      <w:r>
+        <w:t xml:space="preserve"> </w:t>
+      </w:r>
+      <w:proofErr w:type="spellStart"/>
+      <w:r>
+        <w:rPr>
+          <w:rFonts w:ascii="Nirmala UI" w:hAnsi="Nirmala UI" w:cs="Nirmala UI"/>
+        </w:rPr>
+        <w:t>गया</w:t>
+      </w:r>
+      <w:proofErr w:type="spellEnd"/>
+      <w:r>
+        <w:t xml:space="preserve"> </w:t>
+      </w:r>
+      <w:proofErr w:type="spellStart"/>
+      <w:r>
+        <w:rPr>
+          <w:rFonts w:ascii="Nirmala UI" w:hAnsi="Nirmala UI" w:cs="Nirmala UI"/>
+        </w:rPr>
+        <w:t>है</w:t>
+      </w:r>
+      <w:proofErr w:type="spellEnd"/>
+      <w:r>
+        <w:t xml:space="preserve"> — </w:t>
+      </w:r>
+      <w:proofErr w:type="spellStart"/>
+      <w:r>
+        <w:rPr>
+          <w:rFonts w:ascii="Nirmala UI" w:hAnsi="Nirmala UI" w:cs="Nirmala UI"/>
+        </w:rPr>
+        <w:t>लोगों</w:t>
+      </w:r>
+      <w:proofErr w:type="spellEnd"/>
+      <w:r>
+        <w:t xml:space="preserve"> </w:t>
+      </w:r>
+      <w:proofErr w:type="spellStart"/>
+      <w:r>
+        <w:rPr>
+          <w:rFonts w:ascii="Nirmala UI" w:hAnsi="Nirmala UI" w:cs="Nirmala UI"/>
+        </w:rPr>
+        <w:t>को</w:t>
+      </w:r>
+      <w:proofErr w:type="spellEnd"/>
+      <w:r>
+        <w:t xml:space="preserve"> </w:t>
+      </w:r>
+      <w:proofErr w:type="spellStart"/>
+      <w:r>
+        <w:rPr>
+          <w:rFonts w:ascii="Nirmala UI" w:hAnsi="Nirmala UI" w:cs="Nirmala UI"/>
+        </w:rPr>
+        <w:t>अच्छी</w:t>
+      </w:r>
+      <w:proofErr w:type="spellEnd"/>
+      <w:r>
+        <w:t xml:space="preserve"> </w:t>
+      </w:r>
+      <w:proofErr w:type="spellStart"/>
+      <w:r>
+        <w:rPr>
+          <w:rFonts w:ascii="Nirmala UI" w:hAnsi="Nirmala UI" w:cs="Nirmala UI"/>
+        </w:rPr>
+        <w:t>क्वालिटी</w:t>
+      </w:r>
+      <w:proofErr w:type="spellEnd"/>
+      <w:r>
+        <w:t xml:space="preserve"> </w:t>
+      </w:r>
+      <w:proofErr w:type="spellStart"/>
+      <w:r>
+        <w:rPr>
+          <w:rFonts w:ascii="Nirmala UI" w:hAnsi="Nirmala UI" w:cs="Nirmala UI"/>
+        </w:rPr>
+        <w:t>का</w:t>
+      </w:r>
+      <w:proofErr w:type="spellEnd"/>
+      <w:r>
+        <w:t xml:space="preserve"> </w:t>
+      </w:r>
+      <w:proofErr w:type="spellStart"/>
+      <w:r>
+        <w:rPr>
+          <w:rFonts w:ascii="Nirmala UI" w:hAnsi="Nirmala UI" w:cs="Nirmala UI"/>
+        </w:rPr>
+        <w:t>इलाज</w:t>
+      </w:r>
+      <w:proofErr w:type="spellEnd"/>
+      <w:r>
+        <w:t xml:space="preserve">, </w:t>
+      </w:r>
+      <w:proofErr w:type="spellStart"/>
+      <w:r>
+        <w:rPr>
+          <w:rFonts w:ascii="Nirmala UI" w:hAnsi="Nirmala UI" w:cs="Nirmala UI"/>
+        </w:rPr>
+        <w:t>नई</w:t>
+      </w:r>
+      <w:proofErr w:type="spellEnd"/>
+      <w:r>
+        <w:t xml:space="preserve"> </w:t>
+      </w:r>
+      <w:proofErr w:type="spellStart"/>
+      <w:r>
+        <w:rPr>
+          <w:rFonts w:ascii="Nirmala UI" w:hAnsi="Nirmala UI" w:cs="Nirmala UI"/>
+        </w:rPr>
+        <w:t>मेडिकल</w:t>
+      </w:r>
+      <w:proofErr w:type="spellEnd"/>
+      <w:r>
+        <w:t xml:space="preserve"> </w:t>
+      </w:r>
+      <w:proofErr w:type="spellStart"/>
+      <w:r>
+        <w:rPr>
+          <w:rFonts w:ascii="Nirmala UI" w:hAnsi="Nirmala UI" w:cs="Nirmala UI"/>
+        </w:rPr>
+        <w:t>तकनीक</w:t>
+      </w:r>
+      <w:proofErr w:type="spellEnd"/>
+      <w:r>
+        <w:t xml:space="preserve"> </w:t>
+      </w:r>
+      <w:proofErr w:type="spellStart"/>
+      <w:r>
+        <w:rPr>
+          <w:rFonts w:ascii="Nirmala UI" w:hAnsi="Nirmala UI" w:cs="Nirmala UI"/>
+        </w:rPr>
+        <w:t>और</w:t>
+      </w:r>
+      <w:proofErr w:type="spellEnd"/>
+      <w:r>
+        <w:t xml:space="preserve"> </w:t>
+      </w:r>
+      <w:proofErr w:type="spellStart"/>
+      <w:r>
+        <w:rPr>
+          <w:rFonts w:ascii="Nirmala UI" w:hAnsi="Nirmala UI" w:cs="Nirmala UI"/>
+        </w:rPr>
+        <w:t>अनुभवी</w:t>
+      </w:r>
+      <w:proofErr w:type="spellEnd"/>
+      <w:r>
+        <w:t xml:space="preserve"> </w:t>
+      </w:r>
+      <w:proofErr w:type="spellStart"/>
+      <w:r>
+        <w:rPr>
+          <w:rFonts w:ascii="Nirmala UI" w:hAnsi="Nirmala UI" w:cs="Nirmala UI"/>
+        </w:rPr>
+        <w:t>डॉक्टरों</w:t>
+      </w:r>
+      <w:proofErr w:type="spellEnd"/>
+      <w:r>
+        <w:t xml:space="preserve"> </w:t>
+      </w:r>
+      <w:proofErr w:type="spellStart"/>
+      <w:r>
+        <w:rPr>
+          <w:rFonts w:ascii="Nirmala UI" w:hAnsi="Nirmala UI" w:cs="Nirmala UI"/>
+        </w:rPr>
+        <w:t>की</w:t>
+      </w:r>
+      <w:proofErr w:type="spellEnd"/>
+      <w:r>
+        <w:t xml:space="preserve"> </w:t>
+      </w:r>
+      <w:proofErr w:type="spellStart"/>
+      <w:r>
+        <w:rPr>
+          <w:rFonts w:ascii="Nirmala UI" w:hAnsi="Nirmala UI" w:cs="Nirmala UI"/>
+        </w:rPr>
+        <w:t>सेवाएँ</w:t>
+      </w:r>
+      <w:proofErr w:type="spellEnd"/>
+      <w:r>
+        <w:t xml:space="preserve"> </w:t>
+      </w:r>
+      <w:proofErr w:type="spellStart"/>
+      <w:r>
+        <w:rPr>
+          <w:rFonts w:ascii="Nirmala UI" w:hAnsi="Nirmala UI" w:cs="Nirmala UI"/>
+        </w:rPr>
+        <w:t>देना</w:t>
+      </w:r>
+      <w:proofErr w:type="spellEnd"/>
+      <w:r>
+        <w:t xml:space="preserve">, </w:t>
+      </w:r>
+      <w:proofErr w:type="spellStart"/>
+      <w:r>
+        <w:rPr>
+          <w:rFonts w:ascii="Nirmala UI" w:hAnsi="Nirmala UI" w:cs="Nirmala UI"/>
+        </w:rPr>
+        <w:t>और</w:t>
+      </w:r>
+      <w:proofErr w:type="spellEnd"/>
+      <w:r>
+        <w:t xml:space="preserve"> </w:t>
+      </w:r>
+      <w:proofErr w:type="spellStart"/>
+      <w:r>
+        <w:rPr>
+          <w:rFonts w:ascii="Nirmala UI" w:hAnsi="Nirmala UI" w:cs="Nirmala UI"/>
+        </w:rPr>
+        <w:t>साथ</w:t>
+      </w:r>
+      <w:proofErr w:type="spellEnd"/>
+      <w:r>
+        <w:t xml:space="preserve"> </w:t>
+      </w:r>
+      <w:proofErr w:type="spellStart"/>
+      <w:r>
+        <w:rPr>
+          <w:rFonts w:ascii="Nirmala UI" w:hAnsi="Nirmala UI" w:cs="Nirmala UI"/>
+        </w:rPr>
+        <w:t>ही</w:t>
+      </w:r>
+      <w:proofErr w:type="spellEnd"/>
+      <w:r>
+        <w:t xml:space="preserve"> </w:t>
+      </w:r>
+      <w:proofErr w:type="spellStart"/>
+      <w:r>
+        <w:rPr>
+          <w:rFonts w:ascii="Nirmala UI" w:hAnsi="Nirmala UI" w:cs="Nirmala UI"/>
+        </w:rPr>
+        <w:t>यह</w:t>
+      </w:r>
+      <w:proofErr w:type="spellEnd"/>
+      <w:r>
+        <w:t xml:space="preserve"> </w:t>
+      </w:r>
+      <w:proofErr w:type="spellStart"/>
+      <w:r>
+        <w:rPr>
+          <w:rFonts w:ascii="Nirmala UI" w:hAnsi="Nirmala UI" w:cs="Nirmala UI"/>
+        </w:rPr>
+        <w:t>सुनिश्चित</w:t>
+      </w:r>
+      <w:proofErr w:type="spellEnd"/>
+      <w:r>
+        <w:t xml:space="preserve"> </w:t>
+      </w:r>
+      <w:proofErr w:type="spellStart"/>
+      <w:r>
+        <w:rPr>
+          <w:rFonts w:ascii="Nirmala UI" w:hAnsi="Nirmala UI" w:cs="Nirmala UI"/>
+        </w:rPr>
+        <w:t>करना</w:t>
+      </w:r>
+      <w:proofErr w:type="spellEnd"/>
+      <w:r>
+        <w:t xml:space="preserve"> </w:t>
+      </w:r>
+      <w:proofErr w:type="spellStart"/>
+      <w:r>
+        <w:rPr>
+          <w:rFonts w:ascii="Nirmala UI" w:hAnsi="Nirmala UI" w:cs="Nirmala UI"/>
+        </w:rPr>
+        <w:t>कि</w:t>
+      </w:r>
+      <w:proofErr w:type="spellEnd"/>
+      <w:r>
+        <w:t xml:space="preserve"> </w:t>
+      </w:r>
+      <w:proofErr w:type="spellStart"/>
+      <w:r>
+        <w:rPr>
+          <w:rFonts w:ascii="Nirmala UI" w:hAnsi="Nirmala UI" w:cs="Nirmala UI"/>
+        </w:rPr>
+        <w:t>हर</w:t>
+      </w:r>
+      <w:proofErr w:type="spellEnd"/>
+      <w:r>
+        <w:t xml:space="preserve"> </w:t>
+      </w:r>
+      <w:proofErr w:type="spellStart"/>
+      <w:r>
+        <w:rPr>
+          <w:rFonts w:ascii="Nirmala UI" w:hAnsi="Nirmala UI" w:cs="Nirmala UI"/>
+        </w:rPr>
+        <w:t>परिवार</w:t>
+      </w:r>
+      <w:proofErr w:type="spellEnd"/>
+      <w:r>
+        <w:t xml:space="preserve"> </w:t>
+      </w:r>
+      <w:proofErr w:type="spellStart"/>
+      <w:r>
+        <w:rPr>
+          <w:rFonts w:ascii="Nirmala UI" w:hAnsi="Nirmala UI" w:cs="Nirmala UI"/>
+        </w:rPr>
+        <w:t>के</w:t>
+      </w:r>
+      <w:proofErr w:type="spellEnd"/>
+      <w:r>
+        <w:t xml:space="preserve"> </w:t>
+      </w:r>
+      <w:proofErr w:type="spellStart"/>
+      <w:r>
+        <w:rPr>
+          <w:rFonts w:ascii="Nirmala UI" w:hAnsi="Nirmala UI" w:cs="Nirmala UI"/>
+        </w:rPr>
+        <w:t>लिए</w:t>
+      </w:r>
+      <w:proofErr w:type="spellEnd"/>
+      <w:r>
+        <w:t xml:space="preserve"> </w:t>
+      </w:r>
+      <w:proofErr w:type="spellStart"/>
+      <w:r>
+        <w:rPr>
+          <w:rFonts w:ascii="Nirmala UI" w:hAnsi="Nirmala UI" w:cs="Nirmala UI"/>
+        </w:rPr>
+        <w:t>इलाज</w:t>
+      </w:r>
+      <w:proofErr w:type="spellEnd"/>
+      <w:r>
+        <w:t xml:space="preserve"> </w:t>
+      </w:r>
+      <w:proofErr w:type="spellStart"/>
+      <w:r>
+        <w:rPr>
+          <w:rFonts w:ascii="Nirmala UI" w:hAnsi="Nirmala UI" w:cs="Nirmala UI"/>
+        </w:rPr>
+        <w:t>आसानी</w:t>
+      </w:r>
+      <w:proofErr w:type="spellEnd"/>
+      <w:r>
+        <w:t xml:space="preserve"> </w:t>
+      </w:r>
+      <w:proofErr w:type="spellStart"/>
+      <w:r>
+        <w:rPr>
+          <w:rFonts w:ascii="Nirmala UI" w:hAnsi="Nirmala UI" w:cs="Nirmala UI"/>
+        </w:rPr>
+        <w:t>से</w:t>
+      </w:r>
+      <w:proofErr w:type="spellEnd"/>
+      <w:r>
+        <w:t xml:space="preserve"> </w:t>
+      </w:r>
+      <w:proofErr w:type="spellStart"/>
+      <w:r>
+        <w:rPr>
+          <w:rFonts w:ascii="Nirmala UI" w:hAnsi="Nirmala UI" w:cs="Nirmala UI"/>
+        </w:rPr>
+        <w:t>उपलब्ध</w:t>
+      </w:r>
+      <w:proofErr w:type="spellEnd"/>
+      <w:r>
+        <w:t xml:space="preserve"> </w:t>
+      </w:r>
+      <w:proofErr w:type="spellStart"/>
+      <w:r>
+        <w:rPr>
+          <w:rFonts w:ascii="Nirmala UI" w:hAnsi="Nirmala UI" w:cs="Nirmala UI"/>
+        </w:rPr>
+        <w:t>और</w:t>
+      </w:r>
+      <w:proofErr w:type="spellEnd"/>
+      <w:r>
+        <w:t xml:space="preserve"> </w:t>
+      </w:r>
+      <w:proofErr w:type="spellStart"/>
+      <w:r>
+        <w:rPr>
+          <w:rFonts w:ascii="Nirmala UI" w:hAnsi="Nirmala UI" w:cs="Nirmala UI"/>
+        </w:rPr>
+        <w:t>किफायती</w:t>
+      </w:r>
+      <w:proofErr w:type="spellEnd"/>
+      <w:r>
+        <w:t xml:space="preserve"> </w:t>
+      </w:r>
+      <w:proofErr w:type="spellStart"/>
+      <w:r>
+        <w:rPr>
+          <w:rFonts w:ascii="Nirmala UI" w:hAnsi="Nirmala UI" w:cs="Nirmala UI"/>
+        </w:rPr>
+        <w:t>रहे</w:t>
+      </w:r>
+      <w:proofErr w:type="spellEnd"/>
+      <w:r>
+        <w:rPr>
+          <w:rFonts w:ascii="Nirmala UI" w:hAnsi="Nirmala UI" w:cs="Nirmala UI"/>
+        </w:rPr>
+        <w:t>।</w:t>
+      </w:r>
+    </w:p>
+    <w:p/>
+    <w:p>
+      <w:proofErr w:type="spellStart"/>
+      <w:r>
+        <w:rPr>
+          <w:rFonts w:ascii="Nirmala UI" w:hAnsi="Nirmala UI" w:cs="Nirmala UI"/>
+        </w:rPr>
+        <w:t>यह</w:t>
+      </w:r>
+      <w:proofErr w:type="spellEnd"/>
+      <w:r>
+        <w:t xml:space="preserve"> </w:t>
+      </w:r>
+      <w:proofErr w:type="spellStart"/>
+      <w:r>
+        <w:rPr>
+          <w:rFonts w:ascii="Nirmala UI" w:hAnsi="Nirmala UI" w:cs="Nirmala UI"/>
+        </w:rPr>
+        <w:t>पहल</w:t>
+      </w:r>
+      <w:proofErr w:type="spellEnd"/>
+      <w:r>
+        <w:t xml:space="preserve"> </w:t>
+      </w:r>
+      <w:proofErr w:type="spellStart"/>
+      <w:r>
+        <w:rPr>
+          <w:rFonts w:ascii="Nirmala UI" w:hAnsi="Nirmala UI" w:cs="Nirmala UI"/>
+        </w:rPr>
+        <w:t>हमारे</w:t>
+      </w:r>
+      <w:proofErr w:type="spellEnd"/>
+      <w:r>
+        <w:t xml:space="preserve"> </w:t>
+      </w:r>
+      <w:proofErr w:type="spellStart"/>
+      <w:r>
+        <w:rPr>
+          <w:rFonts w:ascii="Nirmala UI" w:hAnsi="Nirmala UI" w:cs="Nirmala UI"/>
+        </w:rPr>
+        <w:t>समाज</w:t>
+      </w:r>
+      <w:proofErr w:type="spellEnd"/>
+      <w:r>
+        <w:t xml:space="preserve"> </w:t>
+      </w:r>
+      <w:proofErr w:type="spellStart"/>
+      <w:r>
+        <w:rPr>
+          <w:rFonts w:ascii="Nirmala UI" w:hAnsi="Nirmala UI" w:cs="Nirmala UI"/>
+        </w:rPr>
+        <w:t>के</w:t>
+      </w:r>
+      <w:proofErr w:type="spellEnd"/>
+      <w:r>
+        <w:t xml:space="preserve"> </w:t>
+      </w:r>
+      <w:proofErr w:type="spellStart"/>
+      <w:r>
+        <w:rPr>
+          <w:rFonts w:ascii="Nirmala UI" w:hAnsi="Nirmala UI" w:cs="Nirmala UI"/>
+        </w:rPr>
+        <w:t>प्रति</w:t>
+      </w:r>
+      <w:proofErr w:type="spellEnd"/>
+      <w:r>
+        <w:t xml:space="preserve"> </w:t>
+      </w:r>
+      <w:proofErr w:type="spellStart"/>
+      <w:r>
+        <w:rPr>
+          <w:rFonts w:ascii="Nirmala UI" w:hAnsi="Nirmala UI" w:cs="Nirmala UI"/>
+        </w:rPr>
+        <w:t>जिम्मेदारी</w:t>
+      </w:r>
+      <w:proofErr w:type="spellEnd"/>
+      <w:r>
+        <w:t xml:space="preserve"> </w:t>
+      </w:r>
+      <w:proofErr w:type="spellStart"/>
+      <w:r>
+        <w:rPr>
+          <w:rFonts w:ascii="Nirmala UI" w:hAnsi="Nirmala UI" w:cs="Nirmala UI"/>
+        </w:rPr>
+        <w:t>और</w:t>
+      </w:r>
+      <w:proofErr w:type="spellEnd"/>
+      <w:r>
+        <w:t xml:space="preserve"> </w:t>
+      </w:r>
+      <w:proofErr w:type="spellStart"/>
+      <w:r>
+        <w:rPr>
+          <w:rFonts w:ascii="Nirmala UI" w:hAnsi="Nirmala UI" w:cs="Nirmala UI"/>
+        </w:rPr>
+        <w:t>लोगों</w:t>
+      </w:r>
+      <w:proofErr w:type="spellEnd"/>
+      <w:r>
+        <w:t xml:space="preserve"> </w:t>
+      </w:r>
+      <w:proofErr w:type="spellStart"/>
+      <w:r>
+        <w:rPr>
+          <w:rFonts w:ascii="Nirmala UI" w:hAnsi="Nirmala UI" w:cs="Nirmala UI"/>
+        </w:rPr>
+        <w:t>की</w:t>
+      </w:r>
+      <w:proofErr w:type="spellEnd"/>
+      <w:r>
+        <w:t xml:space="preserve"> </w:t>
+      </w:r>
+      <w:proofErr w:type="spellStart"/>
+      <w:r>
+        <w:rPr>
+          <w:rFonts w:ascii="Nirmala UI" w:hAnsi="Nirmala UI" w:cs="Nirmala UI"/>
+        </w:rPr>
+        <w:t>भलाई</w:t>
+      </w:r>
+      <w:proofErr w:type="spellEnd"/>
+      <w:r>
+        <w:t xml:space="preserve"> </w:t>
+      </w:r>
+      <w:proofErr w:type="spellStart"/>
+      <w:r>
+        <w:rPr>
+          <w:rFonts w:ascii="Nirmala UI" w:hAnsi="Nirmala UI" w:cs="Nirmala UI"/>
+        </w:rPr>
+        <w:t>के</w:t>
+      </w:r>
+      <w:proofErr w:type="spellEnd"/>
+      <w:r>
+        <w:t xml:space="preserve"> </w:t>
+      </w:r>
+      <w:proofErr w:type="spellStart"/>
+      <w:r>
+        <w:rPr>
+          <w:rFonts w:ascii="Nirmala UI" w:hAnsi="Nirmala UI" w:cs="Nirmala UI"/>
+        </w:rPr>
+        <w:t>प्रति</w:t>
+      </w:r>
+      <w:proofErr w:type="spellEnd"/>
+      <w:r>
+        <w:t xml:space="preserve"> </w:t>
+      </w:r>
+      <w:proofErr w:type="spellStart"/>
+      <w:r>
+        <w:rPr>
+          <w:rFonts w:ascii="Nirmala UI" w:hAnsi="Nirmala UI" w:cs="Nirmala UI"/>
+        </w:rPr>
+        <w:t>हमारी</w:t>
+      </w:r>
+      <w:proofErr w:type="spellEnd"/>
+      <w:r>
+        <w:t xml:space="preserve"> </w:t>
+      </w:r>
+      <w:proofErr w:type="spellStart"/>
+      <w:r>
+        <w:rPr>
+          <w:rFonts w:ascii="Nirmala UI" w:hAnsi="Nirmala UI" w:cs="Nirmala UI"/>
+        </w:rPr>
+        <w:t>सच्ची</w:t>
+      </w:r>
+      <w:proofErr w:type="spellEnd"/>
+      <w:r>
+        <w:t xml:space="preserve"> </w:t>
+      </w:r>
+      <w:proofErr w:type="spellStart"/>
+      <w:r>
+        <w:rPr>
+          <w:rFonts w:ascii="Nirmala UI" w:hAnsi="Nirmala UI" w:cs="Nirmala UI"/>
+        </w:rPr>
+        <w:t>प्रतिबद्धता</w:t>
+      </w:r>
+      <w:proofErr w:type="spellEnd"/>
+      <w:r>
+        <w:t xml:space="preserve"> </w:t>
+      </w:r>
+      <w:proofErr w:type="spellStart"/>
+      <w:r>
+        <w:rPr>
+          <w:rFonts w:ascii="Nirmala UI" w:hAnsi="Nirmala UI" w:cs="Nirmala UI"/>
+        </w:rPr>
+        <w:t>को</w:t>
+      </w:r>
+      <w:proofErr w:type="spellEnd"/>
+      <w:r>
+        <w:t xml:space="preserve"> </w:t>
+      </w:r>
+      <w:proofErr w:type="spellStart"/>
+      <w:r>
+        <w:rPr>
+          <w:rFonts w:ascii="Nirmala UI" w:hAnsi="Nirmala UI" w:cs="Nirmala UI"/>
+        </w:rPr>
+        <w:t>दर्शाती</w:t>
+      </w:r>
+      <w:proofErr w:type="spellEnd"/>
+      <w:r>
+        <w:t xml:space="preserve"> </w:t>
+      </w:r>
+      <w:proofErr w:type="spellStart"/>
+      <w:r>
+        <w:rPr>
+          <w:rFonts w:ascii="Nirmala UI" w:hAnsi="Nirmala UI" w:cs="Nirmala UI"/>
+        </w:rPr>
+        <w:t>है</w:t>
+      </w:r>
+      <w:proofErr w:type="spellEnd"/>
+      <w:r>
+        <w:rPr>
+          <w:rFonts w:ascii="Nirmala UI" w:hAnsi="Nirmala UI" w:cs="Nirmala UI"/>
+        </w:rPr>
+        <w:t>।</w:t>
+      </w:r>
+      <w:r>
+        <w:t xml:space="preserve"> </w:t>
+      </w:r>
+      <w:proofErr w:type="spellStart"/>
+      <w:r>
+        <w:rPr>
+          <w:rFonts w:ascii="Nirmala UI" w:hAnsi="Nirmala UI" w:cs="Nirmala UI"/>
+        </w:rPr>
+        <w:t>हम</w:t>
+      </w:r>
+      <w:proofErr w:type="spellEnd"/>
+      <w:r>
+        <w:t xml:space="preserve"> </w:t>
+      </w:r>
+      <w:proofErr w:type="spellStart"/>
+      <w:r>
+        <w:rPr>
+          <w:rFonts w:ascii="Nirmala UI" w:hAnsi="Nirmala UI" w:cs="Nirmala UI"/>
+        </w:rPr>
+        <w:t>पूरे</w:t>
+      </w:r>
+      <w:proofErr w:type="spellEnd"/>
+      <w:r>
+        <w:t xml:space="preserve"> </w:t>
+      </w:r>
+      <w:proofErr w:type="spellStart"/>
+      <w:r>
+        <w:rPr>
+          <w:rFonts w:ascii="Nirmala UI" w:hAnsi="Nirmala UI" w:cs="Nirmala UI"/>
+        </w:rPr>
+        <w:t>समर्पण</w:t>
+      </w:r>
+      <w:proofErr w:type="spellEnd"/>
+      <w:r>
+        <w:t xml:space="preserve"> </w:t>
+      </w:r>
+      <w:proofErr w:type="spellStart"/>
+      <w:r>
+        <w:rPr>
+          <w:rFonts w:ascii="Nirmala UI" w:hAnsi="Nirmala UI" w:cs="Nirmala UI"/>
+        </w:rPr>
+        <w:t>और</w:t>
+      </w:r>
+      <w:proofErr w:type="spellEnd"/>
+      <w:r>
+        <w:t xml:space="preserve"> </w:t>
+      </w:r>
+      <w:proofErr w:type="spellStart"/>
+      <w:r>
+        <w:rPr>
+          <w:rFonts w:ascii="Nirmala UI" w:hAnsi="Nirmala UI" w:cs="Nirmala UI"/>
+        </w:rPr>
+        <w:t>सेवा</w:t>
+      </w:r>
+      <w:proofErr w:type="spellEnd"/>
+      <w:r>
+        <w:t xml:space="preserve"> </w:t>
+      </w:r>
+      <w:proofErr w:type="spellStart"/>
+      <w:r>
+        <w:rPr>
+          <w:rFonts w:ascii="Nirmala UI" w:hAnsi="Nirmala UI" w:cs="Nirmala UI"/>
+        </w:rPr>
+        <w:t>भाव</w:t>
+      </w:r>
+      <w:proofErr w:type="spellEnd"/>
+      <w:r>
+        <w:t xml:space="preserve"> </w:t>
+      </w:r>
+      <w:proofErr w:type="spellStart"/>
+      <w:r>
+        <w:rPr>
+          <w:rFonts w:ascii="Nirmala UI" w:hAnsi="Nirmala UI" w:cs="Nirmala UI"/>
+        </w:rPr>
+        <w:t>के</w:t>
+      </w:r>
+      <w:proofErr w:type="spellEnd"/>
+      <w:r>
+        <w:t xml:space="preserve"> </w:t>
+      </w:r>
+      <w:proofErr w:type="spellStart"/>
+      <w:r>
+        <w:rPr>
+          <w:rFonts w:ascii="Nirmala UI" w:hAnsi="Nirmala UI" w:cs="Nirmala UI"/>
+        </w:rPr>
+        <w:t>साथ</w:t>
+      </w:r>
+      <w:proofErr w:type="spellEnd"/>
+      <w:r>
+        <w:t xml:space="preserve"> </w:t>
+      </w:r>
+      <w:proofErr w:type="spellStart"/>
+      <w:r>
+        <w:rPr>
+          <w:rFonts w:ascii="Nirmala UI" w:hAnsi="Nirmala UI" w:cs="Nirmala UI"/>
+        </w:rPr>
+        <w:t>इस</w:t>
+      </w:r>
+      <w:proofErr w:type="spellEnd"/>
+      <w:r>
+        <w:t xml:space="preserve"> </w:t>
+      </w:r>
+      <w:proofErr w:type="spellStart"/>
+      <w:r>
+        <w:rPr>
+          <w:rFonts w:ascii="Nirmala UI" w:hAnsi="Nirmala UI" w:cs="Nirmala UI"/>
+        </w:rPr>
+        <w:t>क्षेत्र</w:t>
+      </w:r>
+      <w:proofErr w:type="spellEnd"/>
+      <w:r>
+        <w:t xml:space="preserve"> </w:t>
+      </w:r>
+      <w:proofErr w:type="spellStart"/>
+      <w:r>
+        <w:rPr>
+          <w:rFonts w:ascii="Nirmala UI" w:hAnsi="Nirmala UI" w:cs="Nirmala UI"/>
+        </w:rPr>
+        <w:t>के</w:t>
+      </w:r>
+      <w:proofErr w:type="spellEnd"/>
+      <w:r>
+        <w:t xml:space="preserve"> </w:t>
+      </w:r>
+      <w:proofErr w:type="spellStart"/>
+      <w:r>
+        <w:rPr>
+          <w:rFonts w:ascii="Nirmala UI" w:hAnsi="Nirmala UI" w:cs="Nirmala UI"/>
+        </w:rPr>
+        <w:t>लोगों</w:t>
+      </w:r>
+      <w:proofErr w:type="spellEnd"/>
+      <w:r>
+        <w:t xml:space="preserve"> </w:t>
+      </w:r>
+      <w:proofErr w:type="spellStart"/>
+      <w:r>
+        <w:rPr>
+          <w:rFonts w:ascii="Nirmala UI" w:hAnsi="Nirmala UI" w:cs="Nirmala UI"/>
+        </w:rPr>
+        <w:t>की</w:t>
+      </w:r>
+      <w:proofErr w:type="spellEnd"/>
+      <w:r>
+        <w:t xml:space="preserve"> </w:t>
+      </w:r>
+      <w:proofErr w:type="spellStart"/>
+      <w:r>
+        <w:rPr>
+          <w:rFonts w:ascii="Nirmala UI" w:hAnsi="Nirmala UI" w:cs="Nirmala UI"/>
+        </w:rPr>
+        <w:t>सेवा</w:t>
+      </w:r>
+      <w:proofErr w:type="spellEnd"/>
+      <w:r>
+        <w:t xml:space="preserve"> </w:t>
+      </w:r>
+      <w:proofErr w:type="spellStart"/>
+      <w:r>
+        <w:rPr>
+          <w:rFonts w:ascii="Nirmala UI" w:hAnsi="Nirmala UI" w:cs="Nirmala UI"/>
+        </w:rPr>
+        <w:t>करना</w:t>
+      </w:r>
+      <w:proofErr w:type="spellEnd"/>
+      <w:r>
+        <w:t xml:space="preserve"> </w:t>
+      </w:r>
+      <w:proofErr w:type="spellStart"/>
+      <w:r>
+        <w:rPr>
+          <w:rFonts w:ascii="Nirmala UI" w:hAnsi="Nirmala UI" w:cs="Nirmala UI"/>
+        </w:rPr>
+        <w:t>चाहते</w:t>
+      </w:r>
+      <w:proofErr w:type="spellEnd"/>
+      <w:r>
+        <w:t xml:space="preserve"> </w:t>
+      </w:r>
+      <w:proofErr w:type="spellStart"/>
+      <w:r>
+        <w:rPr>
+          <w:rFonts w:ascii="Nirmala UI" w:hAnsi="Nirmala UI" w:cs="Nirmala UI"/>
+        </w:rPr>
+        <w:t>हैं</w:t>
+      </w:r>
+      <w:proofErr w:type="spellEnd"/>
+      <w:r>
+        <w:rPr>
+          <w:rFonts w:ascii="Nirmala UI" w:hAnsi="Nirmala UI" w:cs="Nirmala UI"/>
+        </w:rPr>
+        <w:t>।</w:t>
+      </w:r>
+      <w:r>
+        <w:t xml:space="preserve"> </w:t>
+      </w:r>
+      <w:proofErr w:type="spellStart"/>
+      <w:r>
+        <w:rPr>
+          <w:rFonts w:ascii="Nirmala UI" w:hAnsi="Nirmala UI" w:cs="Nirmala UI"/>
+        </w:rPr>
+        <w:t>साथ</w:t>
+      </w:r>
+      <w:proofErr w:type="spellEnd"/>
+      <w:r>
+        <w:t xml:space="preserve"> </w:t>
+      </w:r>
+      <w:proofErr w:type="spellStart"/>
+      <w:r>
+        <w:rPr>
+          <w:rFonts w:ascii="Nirmala UI" w:hAnsi="Nirmala UI" w:cs="Nirmala UI"/>
+        </w:rPr>
+        <w:t>ही</w:t>
+      </w:r>
+      <w:proofErr w:type="spellEnd"/>
+      <w:r>
+        <w:t xml:space="preserve"> </w:t>
+      </w:r>
+      <w:proofErr w:type="spellStart"/>
+      <w:r>
+        <w:rPr>
+          <w:rFonts w:ascii="Nirmala UI" w:hAnsi="Nirmala UI" w:cs="Nirmala UI"/>
+        </w:rPr>
+        <w:t>हमारा</w:t>
+      </w:r>
+      <w:proofErr w:type="spellEnd"/>
+      <w:r>
+        <w:t xml:space="preserve"> </w:t>
+      </w:r>
+      <w:proofErr w:type="spellStart"/>
+      <w:r>
+        <w:rPr>
+          <w:rFonts w:ascii="Nirmala UI" w:hAnsi="Nirmala UI" w:cs="Nirmala UI"/>
+        </w:rPr>
+        <w:t>सपना</w:t>
+      </w:r>
+      <w:proofErr w:type="spellEnd"/>
+      <w:r>
+        <w:t xml:space="preserve"> </w:t>
+      </w:r>
+      <w:proofErr w:type="spellStart"/>
+      <w:r>
+        <w:rPr>
+          <w:rFonts w:ascii="Nirmala UI" w:hAnsi="Nirmala UI" w:cs="Nirmala UI"/>
+        </w:rPr>
+        <w:t>है</w:t>
+      </w:r>
+      <w:proofErr w:type="spellEnd"/>
+      <w:r>
+        <w:t xml:space="preserve"> </w:t>
+      </w:r>
+      <w:proofErr w:type="spellStart"/>
+      <w:r>
+        <w:rPr>
+          <w:rFonts w:ascii="Nirmala UI" w:hAnsi="Nirmala UI" w:cs="Nirmala UI"/>
+        </w:rPr>
+        <w:t>कि</w:t>
+      </w:r>
+      <w:proofErr w:type="spellEnd"/>
+      <w:r>
+        <w:t xml:space="preserve"> </w:t>
+      </w:r>
+      <w:proofErr w:type="spellStart"/>
+      <w:r>
+        <w:rPr>
+          <w:rFonts w:ascii="Nirmala UI" w:hAnsi="Nirmala UI" w:cs="Nirmala UI"/>
+        </w:rPr>
+        <w:t>आने</w:t>
+      </w:r>
+      <w:proofErr w:type="spellEnd"/>
+      <w:r>
+        <w:t xml:space="preserve"> </w:t>
+      </w:r>
+      <w:proofErr w:type="spellStart"/>
+      <w:r>
+        <w:rPr>
+          <w:rFonts w:ascii="Nirmala UI" w:hAnsi="Nirmala UI" w:cs="Nirmala UI"/>
+        </w:rPr>
+        <w:t>वाले</w:t>
+      </w:r>
+      <w:proofErr w:type="spellEnd"/>
+      <w:r>
+        <w:t xml:space="preserve"> </w:t>
+      </w:r>
+      <w:proofErr w:type="spellStart"/>
+      <w:r>
+        <w:rPr>
+          <w:rFonts w:ascii="Nirmala UI" w:hAnsi="Nirmala UI" w:cs="Nirmala UI"/>
+        </w:rPr>
+        <w:t>समय</w:t>
+      </w:r>
+      <w:proofErr w:type="spellEnd"/>
+      <w:r>
+        <w:t xml:space="preserve"> </w:t>
+      </w:r>
+      <w:proofErr w:type="spellStart"/>
+      <w:r>
+        <w:rPr>
+          <w:rFonts w:ascii="Nirmala UI" w:hAnsi="Nirmala UI" w:cs="Nirmala UI"/>
+        </w:rPr>
+        <w:t>में</w:t>
+      </w:r>
+      <w:proofErr w:type="spellEnd"/>
+      <w:r>
+        <w:t xml:space="preserve"> </w:t>
+      </w:r>
+      <w:proofErr w:type="spellStart"/>
+      <w:r>
+        <w:rPr>
+          <w:rFonts w:ascii="Nirmala UI" w:hAnsi="Nirmala UI" w:cs="Nirmala UI"/>
+        </w:rPr>
+        <w:t>और</w:t>
+      </w:r>
+      <w:proofErr w:type="spellEnd"/>
+      <w:r>
+        <w:t xml:space="preserve"> </w:t>
+      </w:r>
+      <w:proofErr w:type="spellStart"/>
+      <w:r>
+        <w:rPr>
+          <w:rFonts w:ascii="Nirmala UI" w:hAnsi="Nirmala UI" w:cs="Nirmala UI"/>
+        </w:rPr>
+        <w:t>अस्पताल</w:t>
+      </w:r>
+      <w:proofErr w:type="spellEnd"/>
+      <w:r>
+        <w:t xml:space="preserve"> </w:t>
+      </w:r>
+      <w:proofErr w:type="spellStart"/>
+      <w:r>
+        <w:rPr>
+          <w:rFonts w:ascii="Nirmala UI" w:hAnsi="Nirmala UI" w:cs="Nirmala UI"/>
+        </w:rPr>
+        <w:t>और</w:t>
+      </w:r>
+      <w:proofErr w:type="spellEnd"/>
+      <w:r>
+        <w:t xml:space="preserve"> </w:t>
+      </w:r>
+      <w:proofErr w:type="spellStart"/>
+      <w:r>
+        <w:rPr>
+          <w:rFonts w:ascii="Nirmala UI" w:hAnsi="Nirmala UI" w:cs="Nirmala UI"/>
+        </w:rPr>
+        <w:t>हेल्थकेयर</w:t>
+      </w:r>
+      <w:proofErr w:type="spellEnd"/>
+      <w:r>
+        <w:t xml:space="preserve"> </w:t>
+      </w:r>
+      <w:proofErr w:type="spellStart"/>
+      <w:r>
+        <w:rPr>
+          <w:rFonts w:ascii="Nirmala UI" w:hAnsi="Nirmala UI" w:cs="Nirmala UI"/>
+        </w:rPr>
+        <w:t>सुविधाएँ</w:t>
+      </w:r>
+      <w:proofErr w:type="spellEnd"/>
+      <w:r>
+        <w:t xml:space="preserve"> </w:t>
+      </w:r>
+      <w:proofErr w:type="spellStart"/>
+      <w:r>
+        <w:rPr>
+          <w:rFonts w:ascii="Nirmala UI" w:hAnsi="Nirmala UI" w:cs="Nirmala UI"/>
+        </w:rPr>
+        <w:t>शुरू</w:t>
+      </w:r>
+      <w:proofErr w:type="spellEnd"/>
+      <w:r>
+        <w:t xml:space="preserve"> </w:t>
+      </w:r>
+      <w:proofErr w:type="spellStart"/>
+      <w:r>
+        <w:rPr>
+          <w:rFonts w:ascii="Nirmala UI" w:hAnsi="Nirmala UI" w:cs="Nirmala UI"/>
+        </w:rPr>
+        <w:t>की</w:t>
+      </w:r>
+      <w:proofErr w:type="spellEnd"/>
+      <w:r>
+        <w:t xml:space="preserve"> </w:t>
+      </w:r>
+      <w:proofErr w:type="spellStart"/>
+      <w:r>
+        <w:rPr>
+          <w:rFonts w:ascii="Nirmala UI" w:hAnsi="Nirmala UI" w:cs="Nirmala UI"/>
+        </w:rPr>
+        <w:t>जाएँ</w:t>
+      </w:r>
+      <w:proofErr w:type="spellEnd"/>
+      <w:r>
+        <w:t xml:space="preserve">, </w:t>
+      </w:r>
+      <w:proofErr w:type="spellStart"/>
+      <w:r>
+        <w:rPr>
+          <w:rFonts w:ascii="Nirmala UI" w:hAnsi="Nirmala UI" w:cs="Nirmala UI"/>
+        </w:rPr>
+        <w:t>ताकि</w:t>
+      </w:r>
+      <w:proofErr w:type="spellEnd"/>
+      <w:r>
+        <w:t xml:space="preserve"> </w:t>
+      </w:r>
+      <w:proofErr w:type="spellStart"/>
+      <w:r>
+        <w:rPr>
+          <w:rFonts w:ascii="Nirmala UI" w:hAnsi="Nirmala UI" w:cs="Nirmala UI"/>
+        </w:rPr>
+        <w:t>ऐसे</w:t>
+      </w:r>
+      <w:proofErr w:type="spellEnd"/>
+      <w:r>
+        <w:t xml:space="preserve"> </w:t>
+      </w:r>
+      <w:proofErr w:type="spellStart"/>
+      <w:r>
+        <w:rPr>
+          <w:rFonts w:ascii="Nirmala UI" w:hAnsi="Nirmala UI" w:cs="Nirmala UI"/>
+        </w:rPr>
+        <w:t>कई</w:t>
+      </w:r>
+      <w:proofErr w:type="spellEnd"/>
+      <w:r>
+        <w:t xml:space="preserve"> </w:t>
+      </w:r>
+      <w:proofErr w:type="spellStart"/>
+      <w:r>
+        <w:rPr>
+          <w:rFonts w:ascii="Nirmala UI" w:hAnsi="Nirmala UI" w:cs="Nirmala UI"/>
+        </w:rPr>
+        <w:t>और</w:t>
+      </w:r>
+      <w:proofErr w:type="spellEnd"/>
+      <w:r>
+        <w:t xml:space="preserve"> </w:t>
+      </w:r>
+      <w:proofErr w:type="spellStart"/>
+      <w:r>
+        <w:rPr>
+          <w:rFonts w:ascii="Nirmala UI" w:hAnsi="Nirmala UI" w:cs="Nirmala UI"/>
+        </w:rPr>
+        <w:t>इलाकों</w:t>
+      </w:r>
+      <w:proofErr w:type="spellEnd"/>
+      <w:r>
+        <w:t xml:space="preserve"> </w:t>
+      </w:r>
+      <w:proofErr w:type="spellStart"/>
+      <w:r>
+        <w:rPr>
+          <w:rFonts w:ascii="Nirmala UI" w:hAnsi="Nirmala UI" w:cs="Nirmala UI"/>
+        </w:rPr>
+        <w:t>तक</w:t>
+      </w:r>
+      <w:proofErr w:type="spellEnd"/>
+      <w:r>
+        <w:t xml:space="preserve"> </w:t>
+      </w:r>
+      <w:proofErr w:type="spellStart"/>
+      <w:r>
+        <w:rPr>
+          <w:rFonts w:ascii="Nirmala UI" w:hAnsi="Nirmala UI" w:cs="Nirmala UI"/>
+        </w:rPr>
+        <w:t>अच्छी</w:t>
+      </w:r>
+      <w:proofErr w:type="spellEnd"/>
+      <w:r>
+        <w:t xml:space="preserve"> </w:t>
+      </w:r>
+      <w:proofErr w:type="spellStart"/>
+      <w:r>
+        <w:rPr>
+          <w:rFonts w:ascii="Nirmala UI" w:hAnsi="Nirmala UI" w:cs="Nirmala UI"/>
+        </w:rPr>
+        <w:t>स्वास्थ्य</w:t>
+      </w:r>
+      <w:proofErr w:type="spellEnd"/>
+      <w:r>
+        <w:t xml:space="preserve"> </w:t>
+      </w:r>
+      <w:proofErr w:type="spellStart"/>
+      <w:r>
+        <w:rPr>
+          <w:rFonts w:ascii="Nirmala UI" w:hAnsi="Nirmala UI" w:cs="Nirmala UI"/>
+        </w:rPr>
+        <w:t>सेवाएँ</w:t>
+      </w:r>
+      <w:proofErr w:type="spellEnd"/>
+      <w:r>
+        <w:t xml:space="preserve"> </w:t>
+      </w:r>
+      <w:proofErr w:type="spellStart"/>
+      <w:r>
+        <w:rPr>
+          <w:rFonts w:ascii="Nirmala UI" w:hAnsi="Nirmala UI" w:cs="Nirmala UI"/>
+        </w:rPr>
+        <w:t>पहुँच</w:t>
+      </w:r>
+      <w:proofErr w:type="spellEnd"/>
+      <w:r>
+        <w:t xml:space="preserve"> </w:t>
+      </w:r>
+      <w:proofErr w:type="spellStart"/>
+      <w:r>
+        <w:rPr>
+          <w:rFonts w:ascii="Nirmala UI" w:hAnsi="Nirmala UI" w:cs="Nirmala UI"/>
+        </w:rPr>
+        <w:t>सकें</w:t>
+      </w:r>
+      <w:proofErr w:type="spellEnd"/>
+      <w:r>
+        <w:t xml:space="preserve"> </w:t>
+      </w:r>
+      <w:proofErr w:type="spellStart"/>
+      <w:r>
+        <w:rPr>
+          <w:rFonts w:ascii="Nirmala UI" w:hAnsi="Nirmala UI" w:cs="Nirmala UI"/>
+        </w:rPr>
+        <w:t>जहाँ</w:t>
+      </w:r>
+      <w:proofErr w:type="spellEnd"/>
+      <w:r>
+        <w:t xml:space="preserve"> </w:t>
+      </w:r>
+      <w:proofErr w:type="spellStart"/>
+      <w:r>
+        <w:rPr>
+          <w:rFonts w:ascii="Nirmala UI" w:hAnsi="Nirmala UI" w:cs="Nirmala UI"/>
+        </w:rPr>
+        <w:t>आज</w:t>
+      </w:r>
+      <w:proofErr w:type="spellEnd"/>
+      <w:r>
+        <w:t xml:space="preserve"> </w:t>
+      </w:r>
+      <w:proofErr w:type="spellStart"/>
+      <w:r>
+        <w:rPr>
+          <w:rFonts w:ascii="Nirmala UI" w:hAnsi="Nirmala UI" w:cs="Nirmala UI"/>
+        </w:rPr>
+        <w:t>भी</w:t>
+      </w:r>
+      <w:proofErr w:type="spellEnd"/>
+      <w:r>
+        <w:t xml:space="preserve"> </w:t>
+      </w:r>
+      <w:proofErr w:type="spellStart"/>
+      <w:r>
+        <w:rPr>
+          <w:rFonts w:ascii="Nirmala UI" w:hAnsi="Nirmala UI" w:cs="Nirmala UI"/>
+        </w:rPr>
+        <w:t>इसकी</w:t>
+      </w:r>
+      <w:proofErr w:type="spellEnd"/>
+      <w:r>
+        <w:t xml:space="preserve"> </w:t>
+      </w:r>
+      <w:proofErr w:type="spellStart"/>
+      <w:r>
+        <w:rPr>
+          <w:rFonts w:ascii="Nirmala UI" w:hAnsi="Nirmala UI" w:cs="Nirmala UI"/>
+        </w:rPr>
+        <w:t>कमी</w:t>
+      </w:r>
+      <w:proofErr w:type="spellEnd"/>
+      <w:r>
+        <w:t xml:space="preserve"> </w:t>
+      </w:r>
+      <w:proofErr w:type="spellStart"/>
+      <w:r>
+        <w:rPr>
+          <w:rFonts w:ascii="Nirmala UI" w:hAnsi="Nirmala UI" w:cs="Nirmala UI"/>
+        </w:rPr>
+        <w:t>है</w:t>
+      </w:r>
+      <w:proofErr w:type="spellEnd"/>
+      <w:r>
+        <w:rPr>
+          <w:rFonts w:ascii="Nirmala UI" w:hAnsi="Nirmala UI" w:cs="Nirmala UI"/>
+        </w:rPr>
+        <w:t>।</w:t>
+      </w:r>
+    </w:p>
+    <w:p/>
+    <w:p>
+      <w:proofErr w:type="spellStart"/>
+      <w:r>
+        <w:rPr>
+          <w:rFonts w:ascii="Nirmala UI" w:hAnsi="Nirmala UI" w:cs="Nirmala UI"/>
+        </w:rPr>
+        <w:t>हम</w:t>
+      </w:r>
+      <w:proofErr w:type="spellEnd"/>
+      <w:r>
+        <w:t xml:space="preserve"> </w:t>
+      </w:r>
+      <w:proofErr w:type="spellStart"/>
+      <w:r>
+        <w:rPr>
+          <w:rFonts w:ascii="Nirmala UI" w:hAnsi="Nirmala UI" w:cs="Nirmala UI"/>
+        </w:rPr>
+        <w:t>इस</w:t>
+      </w:r>
+      <w:proofErr w:type="spellEnd"/>
+      <w:r>
+        <w:t xml:space="preserve"> </w:t>
+      </w:r>
+      <w:proofErr w:type="spellStart"/>
+      <w:r>
+        <w:rPr>
+          <w:rFonts w:ascii="Nirmala UI" w:hAnsi="Nirmala UI" w:cs="Nirmala UI"/>
+        </w:rPr>
+        <w:t>क्षेत्र</w:t>
+      </w:r>
+      <w:proofErr w:type="spellEnd"/>
+      <w:r>
+        <w:t xml:space="preserve"> </w:t>
+      </w:r>
+      <w:proofErr w:type="spellStart"/>
+      <w:r>
+        <w:rPr>
+          <w:rFonts w:ascii="Nirmala UI" w:hAnsi="Nirmala UI" w:cs="Nirmala UI"/>
+        </w:rPr>
+        <w:t>के</w:t>
+      </w:r>
+      <w:proofErr w:type="spellEnd"/>
+      <w:r>
+        <w:t xml:space="preserve"> </w:t>
+      </w:r>
+      <w:proofErr w:type="spellStart"/>
+      <w:r>
+        <w:rPr>
+          <w:rFonts w:ascii="Nirmala UI" w:hAnsi="Nirmala UI" w:cs="Nirmala UI"/>
+        </w:rPr>
+        <w:t>लोगों</w:t>
+      </w:r>
+      <w:proofErr w:type="spellEnd"/>
+      <w:r>
+        <w:t xml:space="preserve"> </w:t>
+      </w:r>
+      <w:proofErr w:type="spellStart"/>
+      <w:r>
+        <w:rPr>
+          <w:rFonts w:ascii="Nirmala UI" w:hAnsi="Nirmala UI" w:cs="Nirmala UI"/>
+        </w:rPr>
+        <w:t>का</w:t>
+      </w:r>
+      <w:proofErr w:type="spellEnd"/>
+      <w:r>
+        <w:t xml:space="preserve"> </w:t>
+      </w:r>
+      <w:proofErr w:type="spellStart"/>
+      <w:r>
+        <w:rPr>
+          <w:rFonts w:ascii="Nirmala UI" w:hAnsi="Nirmala UI" w:cs="Nirmala UI"/>
+        </w:rPr>
+        <w:t>दिल</w:t>
+      </w:r>
+      <w:proofErr w:type="spellEnd"/>
+      <w:r>
+        <w:t xml:space="preserve"> </w:t>
+      </w:r>
+      <w:proofErr w:type="spellStart"/>
+      <w:r>
+        <w:rPr>
+          <w:rFonts w:ascii="Nirmala UI" w:hAnsi="Nirmala UI" w:cs="Nirmala UI"/>
+        </w:rPr>
+        <w:t>से</w:t>
+      </w:r>
+      <w:proofErr w:type="spellEnd"/>
+      <w:r>
+        <w:t xml:space="preserve"> </w:t>
+      </w:r>
+      <w:proofErr w:type="spellStart"/>
+      <w:r>
+        <w:rPr>
+          <w:rFonts w:ascii="Nirmala UI" w:hAnsi="Nirmala UI" w:cs="Nirmala UI"/>
+        </w:rPr>
+        <w:t>धन्यवाद</w:t>
+      </w:r>
+      <w:proofErr w:type="spellEnd"/>
+      <w:r>
+        <w:t xml:space="preserve"> </w:t>
+      </w:r>
+      <w:proofErr w:type="spellStart"/>
+      <w:r>
+        <w:rPr>
+          <w:rFonts w:ascii="Nirmala UI" w:hAnsi="Nirmala UI" w:cs="Nirmala UI"/>
+        </w:rPr>
+        <w:t>करते</w:t>
+      </w:r>
+      <w:proofErr w:type="spellEnd"/>
+      <w:r>
+        <w:t xml:space="preserve"> </w:t>
+      </w:r>
+      <w:proofErr w:type="spellStart"/>
+      <w:r>
+        <w:rPr>
+          <w:rFonts w:ascii="Nirmala UI" w:hAnsi="Nirmala UI" w:cs="Nirmala UI"/>
+        </w:rPr>
+        <w:t>हैं</w:t>
+      </w:r>
+      <w:proofErr w:type="spellEnd"/>
+      <w:r>
+        <w:t xml:space="preserve">, </w:t>
+      </w:r>
+      <w:proofErr w:type="spellStart"/>
+      <w:r>
+        <w:rPr>
+          <w:rFonts w:ascii="Nirmala UI" w:hAnsi="Nirmala UI" w:cs="Nirmala UI"/>
+        </w:rPr>
+        <w:t>जिन्होंने</w:t>
+      </w:r>
+      <w:proofErr w:type="spellEnd"/>
+      <w:r>
+        <w:t xml:space="preserve"> </w:t>
+      </w:r>
+      <w:proofErr w:type="spellStart"/>
+      <w:r>
+        <w:rPr>
+          <w:rFonts w:ascii="Nirmala UI" w:hAnsi="Nirmala UI" w:cs="Nirmala UI"/>
+        </w:rPr>
+        <w:t>हम</w:t>
+      </w:r>
+      <w:proofErr w:type="spellEnd"/>
+      <w:r>
+        <w:t xml:space="preserve"> </w:t>
+      </w:r>
+      <w:proofErr w:type="spellStart"/>
+      <w:r>
+        <w:rPr>
+          <w:rFonts w:ascii="Nirmala UI" w:hAnsi="Nirmala UI" w:cs="Nirmala UI"/>
+        </w:rPr>
+        <w:t>पर</w:t>
+      </w:r>
+      <w:proofErr w:type="spellEnd"/>
+      <w:r>
+        <w:t xml:space="preserve"> </w:t>
+      </w:r>
+      <w:proofErr w:type="spellStart"/>
+      <w:r>
+        <w:rPr>
+          <w:rFonts w:ascii="Nirmala UI" w:hAnsi="Nirmala UI" w:cs="Nirmala UI"/>
+        </w:rPr>
+        <w:t>भरोसा</w:t>
+      </w:r>
+      <w:proofErr w:type="spellEnd"/>
+      <w:r>
+        <w:t xml:space="preserve"> </w:t>
+      </w:r>
+      <w:proofErr w:type="spellStart"/>
+      <w:r>
+        <w:rPr>
+          <w:rFonts w:ascii="Nirmala UI" w:hAnsi="Nirmala UI" w:cs="Nirmala UI"/>
+        </w:rPr>
+        <w:t>और</w:t>
+      </w:r>
+      <w:proofErr w:type="spellEnd"/>
+      <w:r>
+        <w:t xml:space="preserve"> </w:t>
+      </w:r>
+      <w:proofErr w:type="spellStart"/>
+      <w:r>
+        <w:rPr>
+          <w:rFonts w:ascii="Nirmala UI" w:hAnsi="Nirmala UI" w:cs="Nirmala UI"/>
+        </w:rPr>
+        <w:t>समर्थन</w:t>
+      </w:r>
+      <w:proofErr w:type="spellEnd"/>
+      <w:r>
+        <w:t xml:space="preserve"> </w:t>
+      </w:r>
+      <w:proofErr w:type="spellStart"/>
+      <w:r>
+        <w:rPr>
+          <w:rFonts w:ascii="Nirmala UI" w:hAnsi="Nirmala UI" w:cs="Nirmala UI"/>
+        </w:rPr>
+        <w:t>दिखाया</w:t>
+      </w:r>
+      <w:proofErr w:type="spellEnd"/>
+      <w:r>
+        <w:t xml:space="preserve"> </w:t>
+      </w:r>
+      <w:proofErr w:type="spellStart"/>
+      <w:r>
+        <w:rPr>
+          <w:rFonts w:ascii="Nirmala UI" w:hAnsi="Nirmala UI" w:cs="Nirmala UI"/>
+        </w:rPr>
+        <w:t>है</w:t>
+      </w:r>
+      <w:proofErr w:type="spellEnd"/>
+      <w:r>
+        <w:rPr>
+          <w:rFonts w:ascii="Nirmala UI" w:hAnsi="Nirmala UI" w:cs="Nirmala UI"/>
+        </w:rPr>
+        <w:t>।</w:t>
+      </w:r>
+      <w:r>
+        <w:t xml:space="preserve"> </w:t>
+      </w:r>
+      <w:proofErr w:type="spellStart"/>
+      <w:r>
+        <w:rPr>
+          <w:rFonts w:ascii="Nirmala UI" w:hAnsi="Nirmala UI" w:cs="Nirmala UI"/>
+        </w:rPr>
+        <w:t>इसी</w:t>
+      </w:r>
+      <w:proofErr w:type="spellEnd"/>
+      <w:r>
+        <w:t xml:space="preserve"> </w:t>
+      </w:r>
+      <w:proofErr w:type="spellStart"/>
+      <w:r>
+        <w:rPr>
+          <w:rFonts w:ascii="Nirmala UI" w:hAnsi="Nirmala UI" w:cs="Nirmala UI"/>
+        </w:rPr>
+        <w:t>विश्वास</w:t>
+      </w:r>
+      <w:proofErr w:type="spellEnd"/>
+      <w:r>
+        <w:t xml:space="preserve"> </w:t>
+      </w:r>
+      <w:proofErr w:type="spellStart"/>
+      <w:r>
+        <w:rPr>
+          <w:rFonts w:ascii="Nirmala UI" w:hAnsi="Nirmala UI" w:cs="Nirmala UI"/>
+        </w:rPr>
+        <w:t>के</w:t>
+      </w:r>
+      <w:proofErr w:type="spellEnd"/>
+      <w:r>
+        <w:t xml:space="preserve"> </w:t>
+      </w:r>
+      <w:proofErr w:type="spellStart"/>
+      <w:r>
+        <w:rPr>
+          <w:rFonts w:ascii="Nirmala UI" w:hAnsi="Nirmala UI" w:cs="Nirmala UI"/>
+        </w:rPr>
+        <w:t>साथ</w:t>
+      </w:r>
+      <w:proofErr w:type="spellEnd"/>
+      <w:r>
+        <w:t xml:space="preserve"> </w:t>
+      </w:r>
+      <w:proofErr w:type="spellStart"/>
+      <w:r>
+        <w:rPr>
+          <w:rFonts w:ascii="Nirmala UI" w:hAnsi="Nirmala UI" w:cs="Nirmala UI"/>
+        </w:rPr>
+        <w:t>हम</w:t>
+      </w:r>
+      <w:proofErr w:type="spellEnd"/>
+      <w:r>
+        <w:t xml:space="preserve"> </w:t>
+      </w:r>
+      <w:proofErr w:type="spellStart"/>
+      <w:r>
+        <w:rPr>
+          <w:rFonts w:ascii="Nirmala UI" w:hAnsi="Nirmala UI" w:cs="Nirmala UI"/>
+        </w:rPr>
+        <w:t>आगे</w:t>
+      </w:r>
+      <w:proofErr w:type="spellEnd"/>
+      <w:r>
+        <w:t xml:space="preserve"> </w:t>
+      </w:r>
+      <w:proofErr w:type="spellStart"/>
+      <w:r>
+        <w:rPr>
+          <w:rFonts w:ascii="Nirmala UI" w:hAnsi="Nirmala UI" w:cs="Nirmala UI"/>
+        </w:rPr>
+        <w:t>भी</w:t>
+      </w:r>
+      <w:proofErr w:type="spellEnd"/>
+      <w:r>
+        <w:t xml:space="preserve"> </w:t>
+      </w:r>
+      <w:proofErr w:type="spellStart"/>
+      <w:r>
+        <w:rPr>
+          <w:rFonts w:ascii="Nirmala UI" w:hAnsi="Nirmala UI" w:cs="Nirmala UI"/>
+        </w:rPr>
+        <w:t>एक</w:t>
+      </w:r>
+      <w:proofErr w:type="spellEnd"/>
+      <w:r>
+        <w:t xml:space="preserve"> </w:t>
+      </w:r>
+      <w:proofErr w:type="spellStart"/>
+      <w:r>
+        <w:rPr>
+          <w:rFonts w:ascii="Nirmala UI" w:hAnsi="Nirmala UI" w:cs="Nirmala UI"/>
+        </w:rPr>
+        <w:t>स्वस्थ</w:t>
+      </w:r>
+      <w:proofErr w:type="spellEnd"/>
+      <w:r>
+        <w:t xml:space="preserve"> </w:t>
+      </w:r>
+      <w:proofErr w:type="spellStart"/>
+      <w:r>
+        <w:rPr>
+          <w:rFonts w:ascii="Nirmala UI" w:hAnsi="Nirmala UI" w:cs="Nirmala UI"/>
+        </w:rPr>
+        <w:t>और</w:t>
+      </w:r>
+      <w:proofErr w:type="spellEnd"/>
+      <w:r>
+        <w:t xml:space="preserve"> </w:t>
+      </w:r>
+      <w:proofErr w:type="spellStart"/>
+      <w:r>
+        <w:rPr>
+          <w:rFonts w:ascii="Nirmala UI" w:hAnsi="Nirmala UI" w:cs="Nirmala UI"/>
+        </w:rPr>
+        <w:t>मजबूत</w:t>
+      </w:r>
+      <w:proofErr w:type="spellEnd"/>
+      <w:r>
+        <w:t xml:space="preserve"> </w:t>
+      </w:r>
+      <w:proofErr w:type="spellStart"/>
+      <w:r>
+        <w:rPr>
+          <w:rFonts w:ascii="Nirmala UI" w:hAnsi="Nirmala UI" w:cs="Nirmala UI"/>
+        </w:rPr>
+        <w:t>समाज</w:t>
+      </w:r>
+      <w:proofErr w:type="spellEnd"/>
+      <w:r>
+        <w:t xml:space="preserve"> </w:t>
+      </w:r>
+      <w:proofErr w:type="spellStart"/>
+      <w:r>
+        <w:rPr>
+          <w:rFonts w:ascii="Nirmala UI" w:hAnsi="Nirmala UI" w:cs="Nirmala UI"/>
+        </w:rPr>
+        <w:t>बनाने</w:t>
+      </w:r>
+      <w:proofErr w:type="spellEnd"/>
+      <w:r>
+        <w:t xml:space="preserve"> </w:t>
+      </w:r>
+      <w:proofErr w:type="spellStart"/>
+      <w:r>
+        <w:rPr>
+          <w:rFonts w:ascii="Nirmala UI" w:hAnsi="Nirmala UI" w:cs="Nirmala UI"/>
+        </w:rPr>
+        <w:t>की</w:t>
+      </w:r>
+      <w:proofErr w:type="spellEnd"/>
+      <w:r>
+        <w:t xml:space="preserve"> </w:t>
+      </w:r>
+      <w:proofErr w:type="spellStart"/>
+      <w:r>
+        <w:rPr>
+          <w:rFonts w:ascii="Nirmala UI" w:hAnsi="Nirmala UI" w:cs="Nirmala UI"/>
+        </w:rPr>
+        <w:t>दिशा</w:t>
+      </w:r>
+      <w:proofErr w:type="spellEnd"/>
+      <w:r>
+        <w:t xml:space="preserve"> </w:t>
+      </w:r>
+      <w:proofErr w:type="spellStart"/>
+      <w:r>
+        <w:rPr>
+          <w:rFonts w:ascii="Nirmala UI" w:hAnsi="Nirmala UI" w:cs="Nirmala UI"/>
+        </w:rPr>
+        <w:t>में</w:t>
+      </w:r>
+      <w:proofErr w:type="spellEnd"/>
+      <w:r>
+        <w:t xml:space="preserve"> </w:t>
+      </w:r>
+      <w:proofErr w:type="spellStart"/>
+      <w:r>
+        <w:rPr>
+          <w:rFonts w:ascii="Nirmala UI" w:hAnsi="Nirmala UI" w:cs="Nirmala UI"/>
+        </w:rPr>
+        <w:t>अपना</w:t>
+      </w:r>
+      <w:proofErr w:type="spellEnd"/>
+      <w:r>
+        <w:t xml:space="preserve"> </w:t>
+      </w:r>
+      <w:proofErr w:type="spellStart"/>
+      <w:r>
+        <w:rPr>
+          <w:rFonts w:ascii="Nirmala UI" w:hAnsi="Nirmala UI" w:cs="Nirmala UI"/>
+        </w:rPr>
+        <w:t>सफर</w:t>
+      </w:r>
+      <w:proofErr w:type="spellEnd"/>
+      <w:r>
+        <w:t xml:space="preserve"> </w:t>
+      </w:r>
+      <w:proofErr w:type="spellStart"/>
+      <w:r>
+        <w:rPr>
+          <w:rFonts w:ascii="Nirmala UI" w:hAnsi="Nirmala UI" w:cs="Nirmala UI"/>
+        </w:rPr>
+        <w:t>जारी</w:t>
+      </w:r>
+      <w:proofErr w:type="spellEnd"/>
+      <w:r>
+        <w:t xml:space="preserve"> </w:t>
+      </w:r>
+      <w:proofErr w:type="spellStart"/>
+      <w:r>
+        <w:rPr>
+          <w:rFonts w:ascii="Nirmala UI" w:hAnsi="Nirmala UI" w:cs="Nirmala UI"/>
+        </w:rPr>
+        <w:t>रखेंगे</w:t>
+      </w:r>
+      <w:proofErr w:type="spellEnd"/>
+      <w:r>
+        <w:rPr>
+          <w:rFonts w:ascii="Nirmala UI" w:hAnsi="Nirmala UI" w:cs="Nirmala UI"/>
+        </w:rPr>
+        <w:t>।</w:t>
+      </w:r>
+    </w:p>
     <w:sectPr>
       <w:pgSz w:w="11906" w:h="16838"/>
       <w:pgMar w:top="1440" w:right="1440" w:bottom="1440" w:left="1440" w:header="708" w:footer="708" w:gutter="0"/>
@@ -4087,6 +8742,7 @@
   <w:style w:type="character" w:default="1" w:styleId="DefaultParagraphFont">
     <w:name w:val="Default Paragraph Font"/>
     <w:uiPriority w:val="1"/>
+    <w:semiHidden/>
     <w:unhideWhenUsed/>
   </w:style>
   <w:style w:type="table" w:default="1" w:styleId="TableNormal">

</xml_diff>